<commit_message>
Update feature extraction method documentation and remove obsolete files
</commit_message>
<xml_diff>
--- a/Coconut-论文写作/大论文初稿_V1.docx
+++ b/Coconut-论文写作/大论文初稿_V1.docx
@@ -2714,17 +2714,17 @@
           <w:rFonts w:hint="eastAsia" w:ascii="黑体" w:hAnsi="黑体" w:eastAsia="黑体"/>
         </w:rPr>
       </w:pPr>
-      <w:bookmarkStart w:id="2" w:name="_Toc1917"/>
-      <w:bookmarkStart w:id="3" w:name="_Toc20836"/>
-      <w:bookmarkStart w:id="4" w:name="_Toc14267"/>
-      <w:bookmarkStart w:id="5" w:name="_Toc11312"/>
-      <w:bookmarkStart w:id="6" w:name="_Toc22550"/>
-      <w:bookmarkStart w:id="7" w:name="_Toc6334"/>
-      <w:bookmarkStart w:id="8" w:name="_Toc2627"/>
+      <w:bookmarkStart w:id="2" w:name="_Toc20836"/>
+      <w:bookmarkStart w:id="3" w:name="_Toc14267"/>
+      <w:bookmarkStart w:id="4" w:name="_Toc22550"/>
+      <w:bookmarkStart w:id="5" w:name="_Toc2627"/>
+      <w:bookmarkStart w:id="6" w:name="_Toc5276"/>
+      <w:bookmarkStart w:id="7" w:name="_Toc15118"/>
+      <w:bookmarkStart w:id="8" w:name="_Toc1917"/>
       <w:bookmarkStart w:id="9" w:name="_Toc10598"/>
-      <w:bookmarkStart w:id="10" w:name="_Toc5276"/>
-      <w:bookmarkStart w:id="11" w:name="_Toc23036"/>
-      <w:bookmarkStart w:id="12" w:name="_Toc15118"/>
+      <w:bookmarkStart w:id="10" w:name="_Toc11312"/>
+      <w:bookmarkStart w:id="11" w:name="_Toc6334"/>
+      <w:bookmarkStart w:id="12" w:name="_Toc23036"/>
       <w:bookmarkStart w:id="13" w:name="_Toc19179"/>
       <w:r>
         <w:rPr>
@@ -3048,17 +3048,17 @@
         </w:rPr>
       </w:pPr>
       <w:bookmarkStart w:id="14" w:name="_Toc7077597"/>
-      <w:bookmarkStart w:id="15" w:name="_Toc23484"/>
-      <w:bookmarkStart w:id="16" w:name="_Toc28608"/>
-      <w:bookmarkStart w:id="17" w:name="_Toc23613"/>
-      <w:bookmarkStart w:id="18" w:name="_Toc12470"/>
-      <w:bookmarkStart w:id="19" w:name="_Toc20500"/>
-      <w:bookmarkStart w:id="20" w:name="_Toc18152"/>
-      <w:bookmarkStart w:id="21" w:name="_Toc30312"/>
+      <w:bookmarkStart w:id="15" w:name="_Toc30312"/>
+      <w:bookmarkStart w:id="16" w:name="_Toc23484"/>
+      <w:bookmarkStart w:id="17" w:name="_Toc12470"/>
+      <w:bookmarkStart w:id="18" w:name="_Toc18152"/>
+      <w:bookmarkStart w:id="19" w:name="_Toc29419"/>
+      <w:bookmarkStart w:id="20" w:name="_Toc31006"/>
+      <w:bookmarkStart w:id="21" w:name="_Toc28608"/>
       <w:bookmarkStart w:id="22" w:name="_Toc30806"/>
       <w:bookmarkStart w:id="23" w:name="_Toc16844"/>
-      <w:bookmarkStart w:id="24" w:name="_Toc29419"/>
-      <w:bookmarkStart w:id="25" w:name="_Toc31006"/>
+      <w:bookmarkStart w:id="24" w:name="_Toc20500"/>
+      <w:bookmarkStart w:id="25" w:name="_Toc23613"/>
       <w:bookmarkStart w:id="26" w:name="_Toc15189"/>
       <w:r>
         <w:rPr>
@@ -3111,18 +3111,18 @@
           <w:b w:val="0"/>
         </w:rPr>
       </w:pPr>
-      <w:bookmarkStart w:id="27" w:name="_Toc5154"/>
-      <w:bookmarkStart w:id="28" w:name="_Toc30054"/>
+      <w:bookmarkStart w:id="27" w:name="_Toc30054"/>
+      <w:bookmarkStart w:id="28" w:name="_Toc17306"/>
       <w:bookmarkStart w:id="29" w:name="_Toc28863"/>
-      <w:bookmarkStart w:id="30" w:name="_Toc7364"/>
-      <w:bookmarkStart w:id="31" w:name="_Toc14977"/>
-      <w:bookmarkStart w:id="32" w:name="_Toc14081"/>
+      <w:bookmarkStart w:id="30" w:name="_Toc14081"/>
+      <w:bookmarkStart w:id="31" w:name="_Toc5154"/>
+      <w:bookmarkStart w:id="32" w:name="_Toc7364"/>
       <w:bookmarkStart w:id="33" w:name="_Toc20105"/>
       <w:bookmarkStart w:id="34" w:name="_Toc9161"/>
       <w:bookmarkStart w:id="35" w:name="_Toc30562"/>
       <w:bookmarkStart w:id="36" w:name="_Toc9"/>
-      <w:bookmarkStart w:id="37" w:name="_Toc17306"/>
-      <w:bookmarkStart w:id="38" w:name="_Toc1738"/>
+      <w:bookmarkStart w:id="37" w:name="_Toc1738"/>
+      <w:bookmarkStart w:id="38" w:name="_Toc14977"/>
       <w:r>
         <w:rPr>
           <w:rFonts w:hint="eastAsia"/>
@@ -5840,19 +5840,19 @@
         </w:rPr>
         <w:fldChar w:fldCharType="end"/>
       </w:r>
-      <w:bookmarkStart w:id="39" w:name="_Toc7077598"/>
-      <w:bookmarkStart w:id="40" w:name="_Toc12218"/>
-      <w:bookmarkStart w:id="41" w:name="_Toc1185"/>
-      <w:bookmarkStart w:id="42" w:name="_Toc13289"/>
+      <w:bookmarkStart w:id="39" w:name="_Toc31380"/>
+      <w:bookmarkStart w:id="40" w:name="_Toc1185"/>
+      <w:bookmarkStart w:id="41" w:name="_Toc11859"/>
+      <w:bookmarkStart w:id="42" w:name="_Toc28574"/>
       <w:bookmarkStart w:id="43" w:name="_Toc1587"/>
-      <w:bookmarkStart w:id="44" w:name="_Toc27761"/>
-      <w:bookmarkStart w:id="45" w:name="_Toc28574"/>
-      <w:bookmarkStart w:id="46" w:name="_Toc31380"/>
-      <w:bookmarkStart w:id="47" w:name="_Toc11859"/>
-      <w:bookmarkStart w:id="48" w:name="_Toc20088"/>
-      <w:bookmarkStart w:id="49" w:name="_Toc22959"/>
-      <w:bookmarkStart w:id="50" w:name="_Toc13147"/>
-      <w:bookmarkStart w:id="51" w:name="_Toc12053"/>
+      <w:bookmarkStart w:id="44" w:name="_Toc12053"/>
+      <w:bookmarkStart w:id="45" w:name="_Toc27761"/>
+      <w:bookmarkStart w:id="46" w:name="_Toc22959"/>
+      <w:bookmarkStart w:id="47" w:name="_Toc13289"/>
+      <w:bookmarkStart w:id="48" w:name="_Toc7077598"/>
+      <w:bookmarkStart w:id="49" w:name="_Toc13147"/>
+      <w:bookmarkStart w:id="50" w:name="_Toc12218"/>
+      <w:bookmarkStart w:id="51" w:name="_Toc20088"/>
       <w:r>
         <w:rPr>
           <w:rFonts w:hint="eastAsia"/>
@@ -7348,19 +7348,19 @@
           <w:bCs w:val="0"/>
         </w:rPr>
       </w:pPr>
-      <w:bookmarkStart w:id="52" w:name="_Toc21608"/>
-      <w:bookmarkStart w:id="53" w:name="_Toc2310"/>
-      <w:bookmarkStart w:id="54" w:name="_Toc9810"/>
-      <w:bookmarkStart w:id="55" w:name="_Toc15418"/>
-      <w:bookmarkStart w:id="56" w:name="_Toc11461"/>
-      <w:bookmarkStart w:id="57" w:name="_Toc10187"/>
-      <w:bookmarkStart w:id="58" w:name="_Toc11815"/>
-      <w:bookmarkStart w:id="59" w:name="_Toc17979"/>
-      <w:bookmarkStart w:id="60" w:name="_Toc18386"/>
-      <w:bookmarkStart w:id="61" w:name="_Toc29451"/>
-      <w:bookmarkStart w:id="62" w:name="_Toc11545"/>
-      <w:bookmarkStart w:id="63" w:name="_Toc21121"/>
-      <w:bookmarkStart w:id="64" w:name="_Toc7077599"/>
+      <w:bookmarkStart w:id="52" w:name="_Toc29451"/>
+      <w:bookmarkStart w:id="53" w:name="_Toc11545"/>
+      <w:bookmarkStart w:id="54" w:name="_Toc21121"/>
+      <w:bookmarkStart w:id="55" w:name="_Toc17979"/>
+      <w:bookmarkStart w:id="56" w:name="_Toc11815"/>
+      <w:bookmarkStart w:id="57" w:name="_Toc21608"/>
+      <w:bookmarkStart w:id="58" w:name="_Toc18386"/>
+      <w:bookmarkStart w:id="59" w:name="_Toc15418"/>
+      <w:bookmarkStart w:id="60" w:name="_Toc9810"/>
+      <w:bookmarkStart w:id="61" w:name="_Toc7077599"/>
+      <w:bookmarkStart w:id="62" w:name="_Toc11461"/>
+      <w:bookmarkStart w:id="63" w:name="_Toc2310"/>
+      <w:bookmarkStart w:id="64" w:name="_Toc10187"/>
       <w:r>
         <w:rPr>
           <w:b w:val="0"/>
@@ -8768,19 +8768,19 @@
         <w:bidi w:val="0"/>
         <w:jc w:val="center"/>
       </w:pPr>
-      <w:bookmarkStart w:id="65" w:name="_Toc28837"/>
-      <w:bookmarkStart w:id="66" w:name="_Toc11833"/>
-      <w:bookmarkStart w:id="67" w:name="_Toc28381"/>
-      <w:bookmarkStart w:id="68" w:name="_Toc7077600"/>
+      <w:bookmarkStart w:id="65" w:name="_Toc11608"/>
+      <w:bookmarkStart w:id="66" w:name="_Toc24530"/>
+      <w:bookmarkStart w:id="67" w:name="_Toc16430"/>
+      <w:bookmarkStart w:id="68" w:name="_Toc29093"/>
       <w:bookmarkStart w:id="69" w:name="_Toc30898"/>
-      <w:bookmarkStart w:id="70" w:name="_Toc29093"/>
-      <w:bookmarkStart w:id="71" w:name="_Toc32049"/>
-      <w:bookmarkStart w:id="72" w:name="_Toc11608"/>
-      <w:bookmarkStart w:id="73" w:name="_Toc24530"/>
-      <w:bookmarkStart w:id="74" w:name="_Toc32029"/>
-      <w:bookmarkStart w:id="75" w:name="_Toc22101"/>
-      <w:bookmarkStart w:id="76" w:name="_Toc2862"/>
-      <w:bookmarkStart w:id="77" w:name="_Toc16430"/>
+      <w:bookmarkStart w:id="70" w:name="_Toc11833"/>
+      <w:bookmarkStart w:id="71" w:name="_Toc32029"/>
+      <w:bookmarkStart w:id="72" w:name="_Toc32049"/>
+      <w:bookmarkStart w:id="73" w:name="_Toc28837"/>
+      <w:bookmarkStart w:id="74" w:name="_Toc2862"/>
+      <w:bookmarkStart w:id="75" w:name="_Toc28381"/>
+      <w:bookmarkStart w:id="76" w:name="_Toc22101"/>
+      <w:bookmarkStart w:id="77" w:name="_Toc7077600"/>
       <w:r>
         <w:t>绪论</w:t>
       </w:r>
@@ -8803,19 +8803,19 @@
         <w:pStyle w:val="4"/>
         <w:bidi w:val="0"/>
       </w:pPr>
-      <w:bookmarkStart w:id="78" w:name="_Toc13363"/>
-      <w:bookmarkStart w:id="79" w:name="_Toc21991"/>
+      <w:bookmarkStart w:id="78" w:name="_Toc30235"/>
+      <w:bookmarkStart w:id="79" w:name="_Toc30608"/>
       <w:bookmarkStart w:id="80" w:name="_Toc31402"/>
-      <w:bookmarkStart w:id="81" w:name="_Toc24067"/>
-      <w:bookmarkStart w:id="82" w:name="_Toc29293"/>
-      <w:bookmarkStart w:id="83" w:name="_Toc30235"/>
-      <w:bookmarkStart w:id="84" w:name="_Toc30608"/>
-      <w:bookmarkStart w:id="85" w:name="_Toc21348"/>
+      <w:bookmarkStart w:id="81" w:name="_Toc21348"/>
+      <w:bookmarkStart w:id="82" w:name="_Toc13363"/>
+      <w:bookmarkStart w:id="83" w:name="_Toc21991"/>
+      <w:bookmarkStart w:id="84" w:name="_Toc24067"/>
+      <w:bookmarkStart w:id="85" w:name="_Toc29293"/>
       <w:bookmarkStart w:id="86" w:name="_Toc7077601"/>
-      <w:bookmarkStart w:id="87" w:name="_Toc1948"/>
-      <w:bookmarkStart w:id="88" w:name="_Toc22610"/>
-      <w:bookmarkStart w:id="89" w:name="_Toc10432"/>
-      <w:bookmarkStart w:id="90" w:name="_Toc11839"/>
+      <w:bookmarkStart w:id="87" w:name="_Toc22610"/>
+      <w:bookmarkStart w:id="88" w:name="_Toc11839"/>
+      <w:bookmarkStart w:id="89" w:name="_Toc1948"/>
+      <w:bookmarkStart w:id="90" w:name="_Toc10432"/>
       <w:r>
         <w:rPr>
           <w:rFonts w:hint="eastAsia"/>
@@ -8855,17 +8855,17 @@
       </w:pPr>
       <w:bookmarkStart w:id="91" w:name="_Toc17234"/>
       <w:bookmarkStart w:id="92" w:name="_Toc8075"/>
-      <w:bookmarkStart w:id="93" w:name="_Toc31577"/>
-      <w:bookmarkStart w:id="94" w:name="_Toc12273"/>
-      <w:bookmarkStart w:id="95" w:name="_Toc5645"/>
-      <w:bookmarkStart w:id="96" w:name="_Toc19673"/>
-      <w:bookmarkStart w:id="97" w:name="_Toc29365"/>
-      <w:bookmarkStart w:id="98" w:name="_Toc7077602"/>
-      <w:bookmarkStart w:id="99" w:name="_Toc24323"/>
-      <w:bookmarkStart w:id="100" w:name="_Toc19377"/>
-      <w:bookmarkStart w:id="101" w:name="_Toc26760"/>
-      <w:bookmarkStart w:id="102" w:name="_Toc20033"/>
-      <w:bookmarkStart w:id="103" w:name="_Toc14469"/>
+      <w:bookmarkStart w:id="93" w:name="_Toc24323"/>
+      <w:bookmarkStart w:id="94" w:name="_Toc5645"/>
+      <w:bookmarkStart w:id="95" w:name="_Toc29365"/>
+      <w:bookmarkStart w:id="96" w:name="_Toc19377"/>
+      <w:bookmarkStart w:id="97" w:name="_Toc7077602"/>
+      <w:bookmarkStart w:id="98" w:name="_Toc26760"/>
+      <w:bookmarkStart w:id="99" w:name="_Toc14469"/>
+      <w:bookmarkStart w:id="100" w:name="_Toc19673"/>
+      <w:bookmarkStart w:id="101" w:name="_Toc20033"/>
+      <w:bookmarkStart w:id="102" w:name="_Toc12273"/>
+      <w:bookmarkStart w:id="103" w:name="_Toc31577"/>
       <w:r>
         <w:rPr>
           <w:rFonts w:hint="eastAsia"/>
@@ -8885,6 +8885,469 @@
         </w:rPr>
         <w:t>研究背景</w:t>
       </w:r>
+    </w:p>
+    <w:p>
+      <w:pPr>
+        <w:rPr>
+          <w:rFonts w:hint="eastAsia"/>
+          <w:b/>
+          <w:bCs/>
+          <w:color w:val="FF0000"/>
+          <w:lang w:val="en-US" w:eastAsia="zh-CN"/>
+        </w:rPr>
+      </w:pPr>
+      <w:r>
+        <w:rPr>
+          <w:rFonts w:hint="eastAsia"/>
+          <w:b/>
+          <w:bCs/>
+          <w:color w:val="FF0000"/>
+          <w:lang w:val="en-US" w:eastAsia="zh-CN"/>
+        </w:rPr>
+        <w:t>因此我觉得需要有新的故事切入点，例如：</w:t>
+      </w:r>
+      <w:r>
+        <w:rPr>
+          <w:rFonts w:ascii="宋体" w:hAnsi="宋体" w:eastAsia="宋体" w:cs="宋体"/>
+          <w:b/>
+          <w:bCs/>
+          <w:color w:val="FF0000"/>
+          <w:sz w:val="24"/>
+          <w:szCs w:val="24"/>
+        </w:rPr>
+        <w:t>当前主流的 Re-ID 研究已无法满足实际应用中日益复杂的全天候环境需求。</w:t>
+      </w:r>
+    </w:p>
+    <w:p>
+      <w:pPr>
+        <w:rPr>
+          <w:rFonts w:hint="eastAsia"/>
+          <w:b/>
+          <w:bCs/>
+          <w:color w:val="FF0000"/>
+          <w:lang w:val="en-US" w:eastAsia="zh-CN"/>
+        </w:rPr>
+      </w:pPr>
+    </w:p>
+    <w:p>
+      <w:pPr>
+        <w:rPr>
+          <w:rFonts w:hint="eastAsia"/>
+          <w:b/>
+          <w:bCs/>
+          <w:color w:val="FF0000"/>
+          <w:lang w:val="en-US" w:eastAsia="zh-CN"/>
+        </w:rPr>
+      </w:pPr>
+      <w:r>
+        <w:drawing>
+          <wp:anchor distT="0" distB="0" distL="114300" distR="114300" simplePos="0" relativeHeight="251661312" behindDoc="0" locked="0" layoutInCell="1" allowOverlap="1">
+            <wp:simplePos x="0" y="0"/>
+            <wp:positionH relativeFrom="column">
+              <wp:posOffset>-71120</wp:posOffset>
+            </wp:positionH>
+            <wp:positionV relativeFrom="paragraph">
+              <wp:posOffset>133985</wp:posOffset>
+            </wp:positionV>
+            <wp:extent cx="5299710" cy="4069080"/>
+            <wp:effectExtent l="0" t="0" r="8890" b="7620"/>
+            <wp:wrapSquare wrapText="bothSides"/>
+            <wp:docPr id="5" name="图片 30"/>
+            <wp:cNvGraphicFramePr>
+              <a:graphicFrameLocks xmlns:a="http://schemas.openxmlformats.org/drawingml/2006/main" noChangeAspect="1"/>
+            </wp:cNvGraphicFramePr>
+            <a:graphic xmlns:a="http://schemas.openxmlformats.org/drawingml/2006/main">
+              <a:graphicData uri="http://schemas.openxmlformats.org/drawingml/2006/picture">
+                <pic:pic xmlns:pic="http://schemas.openxmlformats.org/drawingml/2006/picture">
+                  <pic:nvPicPr>
+                    <pic:cNvPr id="5" name="图片 30"/>
+                    <pic:cNvPicPr>
+                      <a:picLocks noChangeAspect="1"/>
+                    </pic:cNvPicPr>
+                  </pic:nvPicPr>
+                  <pic:blipFill>
+                    <a:blip r:embed="rId21"/>
+                    <a:stretch>
+                      <a:fillRect/>
+                    </a:stretch>
+                  </pic:blipFill>
+                  <pic:spPr>
+                    <a:xfrm>
+                      <a:off x="0" y="0"/>
+                      <a:ext cx="5299710" cy="4069080"/>
+                    </a:xfrm>
+                    <a:prstGeom prst="rect">
+                      <a:avLst/>
+                    </a:prstGeom>
+                    <a:noFill/>
+                    <a:ln>
+                      <a:noFill/>
+                    </a:ln>
+                  </pic:spPr>
+                </pic:pic>
+              </a:graphicData>
+            </a:graphic>
+          </wp:anchor>
+        </w:drawing>
+      </w:r>
+    </w:p>
+    <w:p>
+      <w:pPr>
+        <w:rPr>
+          <w:rFonts w:hint="eastAsia"/>
+          <w:b/>
+          <w:bCs/>
+          <w:color w:val="FF0000"/>
+          <w:lang w:val="en-US" w:eastAsia="zh-CN"/>
+        </w:rPr>
+      </w:pPr>
+    </w:p>
+    <w:p>
+      <w:pPr>
+        <w:rPr>
+          <w:rFonts w:hint="eastAsia"/>
+          <w:b/>
+          <w:bCs/>
+          <w:color w:val="FF0000"/>
+          <w:lang w:val="en-US" w:eastAsia="zh-CN"/>
+        </w:rPr>
+      </w:pPr>
+    </w:p>
+    <w:p>
+      <w:pPr>
+        <w:rPr>
+          <w:rFonts w:hint="eastAsia"/>
+          <w:b/>
+          <w:bCs/>
+          <w:color w:val="FF0000"/>
+          <w:lang w:val="en-US" w:eastAsia="zh-CN"/>
+        </w:rPr>
+      </w:pPr>
+    </w:p>
+    <w:p>
+      <w:pPr>
+        <w:rPr>
+          <w:rFonts w:hint="eastAsia"/>
+          <w:b/>
+          <w:bCs/>
+          <w:color w:val="FF0000"/>
+          <w:lang w:val="en-US" w:eastAsia="zh-CN"/>
+        </w:rPr>
+      </w:pPr>
+    </w:p>
+    <w:p>
+      <w:pPr>
+        <w:rPr>
+          <w:rFonts w:hint="eastAsia"/>
+          <w:b/>
+          <w:bCs/>
+          <w:color w:val="FF0000"/>
+          <w:lang w:val="en-US" w:eastAsia="zh-CN"/>
+        </w:rPr>
+      </w:pPr>
+    </w:p>
+    <w:p>
+      <w:pPr>
+        <w:rPr>
+          <w:rFonts w:hint="eastAsia"/>
+          <w:b/>
+          <w:bCs/>
+          <w:color w:val="FF0000"/>
+          <w:lang w:val="en-US" w:eastAsia="zh-CN"/>
+        </w:rPr>
+      </w:pPr>
+    </w:p>
+    <w:p>
+      <w:pPr>
+        <w:rPr>
+          <w:rFonts w:hint="eastAsia"/>
+          <w:b/>
+          <w:bCs/>
+          <w:color w:val="FF0000"/>
+          <w:lang w:val="en-US" w:eastAsia="zh-CN"/>
+        </w:rPr>
+      </w:pPr>
+    </w:p>
+    <w:p>
+      <w:pPr>
+        <w:rPr>
+          <w:rFonts w:hint="eastAsia"/>
+          <w:b/>
+          <w:bCs/>
+          <w:color w:val="FF0000"/>
+          <w:lang w:val="en-US" w:eastAsia="zh-CN"/>
+        </w:rPr>
+      </w:pPr>
+    </w:p>
+    <w:p>
+      <w:pPr>
+        <w:rPr>
+          <w:rFonts w:hint="eastAsia"/>
+          <w:b/>
+          <w:bCs/>
+          <w:color w:val="FF0000"/>
+          <w:lang w:val="en-US" w:eastAsia="zh-CN"/>
+        </w:rPr>
+      </w:pPr>
+    </w:p>
+    <w:p>
+      <w:pPr>
+        <w:rPr>
+          <w:rFonts w:hint="eastAsia"/>
+          <w:b/>
+          <w:bCs/>
+          <w:color w:val="FF0000"/>
+          <w:lang w:val="en-US" w:eastAsia="zh-CN"/>
+        </w:rPr>
+      </w:pPr>
+    </w:p>
+    <w:p>
+      <w:pPr>
+        <w:rPr>
+          <w:rFonts w:hint="eastAsia"/>
+          <w:b/>
+          <w:bCs/>
+          <w:color w:val="FF0000"/>
+          <w:lang w:val="en-US" w:eastAsia="zh-CN"/>
+        </w:rPr>
+      </w:pPr>
+    </w:p>
+    <w:p>
+      <w:pPr>
+        <w:rPr>
+          <w:rFonts w:hint="eastAsia"/>
+          <w:b/>
+          <w:bCs/>
+          <w:color w:val="FF0000"/>
+          <w:lang w:val="en-US" w:eastAsia="zh-CN"/>
+        </w:rPr>
+      </w:pPr>
+    </w:p>
+    <w:p>
+      <w:pPr>
+        <w:rPr>
+          <w:rFonts w:hint="eastAsia"/>
+          <w:b/>
+          <w:bCs/>
+          <w:color w:val="FF0000"/>
+          <w:lang w:val="en-US" w:eastAsia="zh-CN"/>
+        </w:rPr>
+      </w:pPr>
+    </w:p>
+    <w:p>
+      <w:pPr>
+        <w:rPr>
+          <w:rFonts w:hint="eastAsia"/>
+          <w:b/>
+          <w:bCs/>
+          <w:color w:val="FF0000"/>
+          <w:lang w:val="en-US" w:eastAsia="zh-CN"/>
+        </w:rPr>
+      </w:pPr>
+    </w:p>
+    <w:p>
+      <w:pPr>
+        <w:rPr>
+          <w:rFonts w:hint="eastAsia"/>
+          <w:b/>
+          <w:bCs/>
+          <w:color w:val="FF0000"/>
+          <w:lang w:val="en-US" w:eastAsia="zh-CN"/>
+        </w:rPr>
+      </w:pPr>
+    </w:p>
+    <w:p>
+      <w:pPr>
+        <w:rPr>
+          <w:rFonts w:hint="eastAsia"/>
+          <w:b/>
+          <w:bCs/>
+          <w:color w:val="FF0000"/>
+          <w:lang w:val="en-US" w:eastAsia="zh-CN"/>
+        </w:rPr>
+      </w:pPr>
+    </w:p>
+    <w:p>
+      <w:pPr>
+        <w:rPr>
+          <w:rFonts w:hint="eastAsia"/>
+          <w:b/>
+          <w:bCs/>
+          <w:color w:val="FF0000"/>
+          <w:lang w:val="en-US" w:eastAsia="zh-CN"/>
+        </w:rPr>
+      </w:pPr>
+    </w:p>
+    <w:p>
+      <w:pPr>
+        <w:rPr>
+          <w:rFonts w:hint="eastAsia"/>
+          <w:b/>
+          <w:bCs/>
+          <w:color w:val="FF0000"/>
+          <w:lang w:val="en-US" w:eastAsia="zh-CN"/>
+        </w:rPr>
+      </w:pPr>
+    </w:p>
+    <w:p>
+      <w:pPr>
+        <w:rPr>
+          <w:rFonts w:hint="eastAsia"/>
+          <w:b/>
+          <w:bCs/>
+          <w:color w:val="FF0000"/>
+          <w:lang w:val="en-US" w:eastAsia="zh-CN"/>
+        </w:rPr>
+      </w:pPr>
+    </w:p>
+    <w:p>
+      <w:pPr>
+        <w:rPr>
+          <w:rFonts w:hint="eastAsia"/>
+          <w:b/>
+          <w:bCs/>
+          <w:color w:val="FF0000"/>
+          <w:lang w:val="en-US" w:eastAsia="zh-CN"/>
+        </w:rPr>
+      </w:pPr>
+    </w:p>
+    <w:p>
+      <w:pPr>
+        <w:rPr>
+          <w:rFonts w:hint="eastAsia"/>
+          <w:b/>
+          <w:bCs/>
+          <w:color w:val="FF0000"/>
+          <w:lang w:val="en-US" w:eastAsia="zh-CN"/>
+        </w:rPr>
+      </w:pPr>
+    </w:p>
+    <w:p>
+      <w:pPr>
+        <w:rPr>
+          <w:rFonts w:hint="eastAsia"/>
+          <w:b/>
+          <w:bCs/>
+          <w:color w:val="FF0000"/>
+          <w:lang w:val="en-US" w:eastAsia="zh-CN"/>
+        </w:rPr>
+      </w:pPr>
+    </w:p>
+    <w:p>
+      <w:pPr>
+        <w:rPr>
+          <w:rFonts w:hint="eastAsia"/>
+          <w:b/>
+          <w:bCs/>
+          <w:color w:val="FF0000"/>
+          <w:lang w:val="en-US" w:eastAsia="zh-CN"/>
+        </w:rPr>
+      </w:pPr>
+    </w:p>
+    <w:p>
+      <w:pPr>
+        <w:rPr>
+          <w:rFonts w:hint="eastAsia"/>
+          <w:b/>
+          <w:bCs/>
+          <w:color w:val="FF0000"/>
+          <w:lang w:val="en-US" w:eastAsia="zh-CN"/>
+        </w:rPr>
+      </w:pPr>
+      <w:r>
+        <w:drawing>
+          <wp:anchor distT="0" distB="0" distL="114300" distR="114300" simplePos="0" relativeHeight="251662336" behindDoc="0" locked="0" layoutInCell="1" allowOverlap="1">
+            <wp:simplePos x="0" y="0"/>
+            <wp:positionH relativeFrom="column">
+              <wp:posOffset>635</wp:posOffset>
+            </wp:positionH>
+            <wp:positionV relativeFrom="paragraph">
+              <wp:posOffset>85725</wp:posOffset>
+            </wp:positionV>
+            <wp:extent cx="5755005" cy="2764790"/>
+            <wp:effectExtent l="0" t="0" r="10795" b="3810"/>
+            <wp:wrapSquare wrapText="bothSides"/>
+            <wp:docPr id="7" name="图片 31"/>
+            <wp:cNvGraphicFramePr>
+              <a:graphicFrameLocks xmlns:a="http://schemas.openxmlformats.org/drawingml/2006/main" noChangeAspect="1"/>
+            </wp:cNvGraphicFramePr>
+            <a:graphic xmlns:a="http://schemas.openxmlformats.org/drawingml/2006/main">
+              <a:graphicData uri="http://schemas.openxmlformats.org/drawingml/2006/picture">
+                <pic:pic xmlns:pic="http://schemas.openxmlformats.org/drawingml/2006/picture">
+                  <pic:nvPicPr>
+                    <pic:cNvPr id="7" name="图片 31"/>
+                    <pic:cNvPicPr>
+                      <a:picLocks noChangeAspect="1"/>
+                    </pic:cNvPicPr>
+                  </pic:nvPicPr>
+                  <pic:blipFill>
+                    <a:blip r:embed="rId22"/>
+                    <a:stretch>
+                      <a:fillRect/>
+                    </a:stretch>
+                  </pic:blipFill>
+                  <pic:spPr>
+                    <a:xfrm>
+                      <a:off x="0" y="0"/>
+                      <a:ext cx="5755005" cy="2764790"/>
+                    </a:xfrm>
+                    <a:prstGeom prst="rect">
+                      <a:avLst/>
+                    </a:prstGeom>
+                    <a:noFill/>
+                    <a:ln>
+                      <a:noFill/>
+                    </a:ln>
+                  </pic:spPr>
+                </pic:pic>
+              </a:graphicData>
+            </a:graphic>
+          </wp:anchor>
+        </w:drawing>
+      </w:r>
+    </w:p>
+    <w:p>
+      <w:pPr>
+        <w:rPr>
+          <w:rFonts w:hint="eastAsia"/>
+          <w:b/>
+          <w:bCs/>
+          <w:color w:val="FF0000"/>
+          <w:lang w:val="en-US" w:eastAsia="zh-CN"/>
+        </w:rPr>
+      </w:pPr>
+    </w:p>
+    <w:p/>
+    <w:p/>
+    <w:p/>
+    <w:p/>
+    <w:p/>
+    <w:p/>
+    <w:p/>
+    <w:p/>
+    <w:p/>
+    <w:p/>
+    <w:p/>
+    <w:p/>
+    <w:p/>
+    <w:p/>
+    <w:p/>
+    <w:p/>
+    <w:p/>
+    <w:p/>
+    <w:p/>
+    <w:p/>
+    <w:p/>
+    <w:p>
+      <w:pPr>
+        <w:rPr>
+          <w:rFonts w:hint="default"/>
+          <w:b/>
+          <w:bCs/>
+          <w:color w:val="FF0000"/>
+          <w:lang w:val="en-US" w:eastAsia="zh-CN"/>
+        </w:rPr>
+      </w:pPr>
     </w:p>
     <w:p>
       <w:pPr>
@@ -9123,6 +9586,8 @@
           <w:lang w:val="en-US" w:eastAsia="zh-CN"/>
         </w:rPr>
       </w:pPr>
+      <w:bookmarkStart w:id="621" w:name="_GoBack"/>
+      <w:bookmarkEnd w:id="621"/>
       <w:r>
         <w:rPr>
           <w:rFonts w:hint="eastAsia"/>
@@ -9509,19 +9974,19 @@
       <w:pPr>
         <w:pStyle w:val="29"/>
       </w:pPr>
-      <w:bookmarkStart w:id="104" w:name="_Toc32409"/>
-      <w:bookmarkStart w:id="105" w:name="_Toc19857"/>
-      <w:bookmarkStart w:id="106" w:name="_Toc26018"/>
-      <w:bookmarkStart w:id="107" w:name="_Toc7077603"/>
-      <w:bookmarkStart w:id="108" w:name="_Toc25436"/>
-      <w:bookmarkStart w:id="109" w:name="_Toc31723"/>
-      <w:bookmarkStart w:id="110" w:name="_Toc22067"/>
-      <w:bookmarkStart w:id="111" w:name="_Toc16688"/>
-      <w:bookmarkStart w:id="112" w:name="_Toc706"/>
-      <w:bookmarkStart w:id="113" w:name="_Toc14965"/>
-      <w:bookmarkStart w:id="114" w:name="_Toc8884"/>
-      <w:bookmarkStart w:id="115" w:name="_Toc20182"/>
-      <w:bookmarkStart w:id="116" w:name="_Toc25426"/>
+      <w:bookmarkStart w:id="104" w:name="_Toc7077603"/>
+      <w:bookmarkStart w:id="105" w:name="_Toc31723"/>
+      <w:bookmarkStart w:id="106" w:name="_Toc25426"/>
+      <w:bookmarkStart w:id="107" w:name="_Toc32409"/>
+      <w:bookmarkStart w:id="108" w:name="_Toc26018"/>
+      <w:bookmarkStart w:id="109" w:name="_Toc22067"/>
+      <w:bookmarkStart w:id="110" w:name="_Toc16688"/>
+      <w:bookmarkStart w:id="111" w:name="_Toc706"/>
+      <w:bookmarkStart w:id="112" w:name="_Toc19857"/>
+      <w:bookmarkStart w:id="113" w:name="_Toc25436"/>
+      <w:bookmarkStart w:id="114" w:name="_Toc14965"/>
+      <w:bookmarkStart w:id="115" w:name="_Toc8884"/>
+      <w:bookmarkStart w:id="116" w:name="_Toc20182"/>
       <w:r>
         <w:rPr>
           <w:rFonts w:hint="eastAsia"/>
@@ -9661,7 +10126,7 @@
                     </pic:cNvPicPr>
                   </pic:nvPicPr>
                   <pic:blipFill>
-                    <a:blip r:embed="rId21"/>
+                    <a:blip r:embed="rId23"/>
                     <a:stretch>
                       <a:fillRect/>
                     </a:stretch>
@@ -9753,17 +10218,17 @@
       <w:r>
         <w:fldChar w:fldCharType="end"/>
       </w:r>
-      <w:bookmarkStart w:id="118" w:name="_Toc6233"/>
-      <w:bookmarkStart w:id="119" w:name="_Toc18620"/>
-      <w:bookmarkStart w:id="120" w:name="_Toc7849"/>
-      <w:bookmarkStart w:id="121" w:name="_Toc1009"/>
-      <w:bookmarkStart w:id="122" w:name="_Toc22102"/>
-      <w:bookmarkStart w:id="123" w:name="_Toc26037"/>
-      <w:bookmarkStart w:id="124" w:name="_Toc28708"/>
-      <w:bookmarkStart w:id="125" w:name="_Toc12467"/>
-      <w:bookmarkStart w:id="126" w:name="_Toc17317"/>
-      <w:bookmarkStart w:id="127" w:name="_Toc12326"/>
-      <w:bookmarkStart w:id="128" w:name="_Toc31617"/>
+      <w:bookmarkStart w:id="118" w:name="_Toc17317"/>
+      <w:bookmarkStart w:id="119" w:name="_Toc1009"/>
+      <w:bookmarkStart w:id="120" w:name="_Toc22102"/>
+      <w:bookmarkStart w:id="121" w:name="_Toc12326"/>
+      <w:bookmarkStart w:id="122" w:name="_Toc12467"/>
+      <w:bookmarkStart w:id="123" w:name="_Toc6233"/>
+      <w:bookmarkStart w:id="124" w:name="_Toc7849"/>
+      <w:bookmarkStart w:id="125" w:name="_Toc31617"/>
+      <w:bookmarkStart w:id="126" w:name="_Toc26037"/>
+      <w:bookmarkStart w:id="127" w:name="_Toc18620"/>
+      <w:bookmarkStart w:id="128" w:name="_Toc28708"/>
       <w:r>
         <w:t xml:space="preserve"> </w:t>
       </w:r>
@@ -10063,18 +10528,18 @@
           <w:rFonts w:hint="eastAsia"/>
         </w:rPr>
       </w:pPr>
-      <w:bookmarkStart w:id="129" w:name="_Toc13467"/>
-      <w:bookmarkStart w:id="130" w:name="_Toc477"/>
-      <w:bookmarkStart w:id="131" w:name="_Toc28836"/>
-      <w:bookmarkStart w:id="132" w:name="_Toc19708"/>
-      <w:bookmarkStart w:id="133" w:name="_Toc12100"/>
-      <w:bookmarkStart w:id="134" w:name="_Toc26769"/>
-      <w:bookmarkStart w:id="135" w:name="_Toc9332"/>
-      <w:bookmarkStart w:id="136" w:name="_Toc28174"/>
+      <w:bookmarkStart w:id="129" w:name="_Toc20276"/>
+      <w:bookmarkStart w:id="130" w:name="_Toc12100"/>
+      <w:bookmarkStart w:id="131" w:name="_Toc9332"/>
+      <w:bookmarkStart w:id="132" w:name="_Toc28174"/>
+      <w:bookmarkStart w:id="133" w:name="_Toc28836"/>
+      <w:bookmarkStart w:id="134" w:name="_Toc19708"/>
+      <w:bookmarkStart w:id="135" w:name="_Toc13467"/>
+      <w:bookmarkStart w:id="136" w:name="_Toc26769"/>
       <w:bookmarkStart w:id="137" w:name="_Toc1730"/>
       <w:bookmarkStart w:id="138" w:name="_Toc6514"/>
-      <w:bookmarkStart w:id="139" w:name="_Toc18311"/>
-      <w:bookmarkStart w:id="140" w:name="_Toc20276"/>
+      <w:bookmarkStart w:id="139" w:name="_Toc477"/>
+      <w:bookmarkStart w:id="140" w:name="_Toc18311"/>
       <w:r>
         <w:rPr>
           <w:rFonts w:hint="eastAsia"/>
@@ -10428,18 +10893,18 @@
         <w:jc w:val="center"/>
       </w:pPr>
       <w:bookmarkStart w:id="141" w:name="_Toc7077605"/>
-      <w:bookmarkStart w:id="142" w:name="_Toc25385"/>
-      <w:bookmarkStart w:id="143" w:name="_Toc30906"/>
-      <w:bookmarkStart w:id="144" w:name="_Toc19766"/>
-      <w:bookmarkStart w:id="145" w:name="_Toc22645"/>
-      <w:bookmarkStart w:id="146" w:name="_Toc18445"/>
-      <w:bookmarkStart w:id="147" w:name="_Toc19423"/>
-      <w:bookmarkStart w:id="148" w:name="_Toc11863"/>
-      <w:bookmarkStart w:id="149" w:name="_Toc29367"/>
-      <w:bookmarkStart w:id="150" w:name="_Toc30568"/>
-      <w:bookmarkStart w:id="151" w:name="_Toc11818"/>
-      <w:bookmarkStart w:id="152" w:name="_Toc5321"/>
-      <w:bookmarkStart w:id="153" w:name="_Toc30929"/>
+      <w:bookmarkStart w:id="142" w:name="_Toc19423"/>
+      <w:bookmarkStart w:id="143" w:name="_Toc11818"/>
+      <w:bookmarkStart w:id="144" w:name="_Toc11863"/>
+      <w:bookmarkStart w:id="145" w:name="_Toc30568"/>
+      <w:bookmarkStart w:id="146" w:name="_Toc30929"/>
+      <w:bookmarkStart w:id="147" w:name="_Toc5321"/>
+      <w:bookmarkStart w:id="148" w:name="_Toc29367"/>
+      <w:bookmarkStart w:id="149" w:name="_Toc30906"/>
+      <w:bookmarkStart w:id="150" w:name="_Toc19766"/>
+      <w:bookmarkStart w:id="151" w:name="_Toc25385"/>
+      <w:bookmarkStart w:id="152" w:name="_Toc22645"/>
+      <w:bookmarkStart w:id="153" w:name="_Toc18445"/>
       <w:r>
         <w:rPr>
           <w:rFonts w:hint="eastAsia"/>
@@ -10504,15 +10969,15 @@
         </w:rPr>
       </w:pPr>
       <w:bookmarkStart w:id="155" w:name="_Toc19868"/>
-      <w:bookmarkStart w:id="156" w:name="_Toc24290"/>
-      <w:bookmarkStart w:id="157" w:name="_Toc14249"/>
-      <w:bookmarkStart w:id="158" w:name="_Toc9598"/>
-      <w:bookmarkStart w:id="159" w:name="_Toc20460"/>
-      <w:bookmarkStart w:id="160" w:name="_Toc7150"/>
-      <w:bookmarkStart w:id="161" w:name="_Toc24742"/>
-      <w:bookmarkStart w:id="162" w:name="_Toc13697"/>
-      <w:bookmarkStart w:id="163" w:name="_Toc25703"/>
-      <w:bookmarkStart w:id="164" w:name="_Toc24022"/>
+      <w:bookmarkStart w:id="156" w:name="_Toc14249"/>
+      <w:bookmarkStart w:id="157" w:name="_Toc7150"/>
+      <w:bookmarkStart w:id="158" w:name="_Toc24742"/>
+      <w:bookmarkStart w:id="159" w:name="_Toc13697"/>
+      <w:bookmarkStart w:id="160" w:name="_Toc25703"/>
+      <w:bookmarkStart w:id="161" w:name="_Toc24022"/>
+      <w:bookmarkStart w:id="162" w:name="_Toc24290"/>
+      <w:bookmarkStart w:id="163" w:name="_Toc9598"/>
+      <w:bookmarkStart w:id="164" w:name="_Toc20460"/>
       <w:bookmarkStart w:id="165" w:name="_Toc25267"/>
       <w:bookmarkStart w:id="166" w:name="_Toc17806"/>
       <w:r>
@@ -10570,17 +11035,17 @@
         <w:pStyle w:val="5"/>
         <w:bidi w:val="0"/>
       </w:pPr>
-      <w:bookmarkStart w:id="168" w:name="_Toc21652"/>
-      <w:bookmarkStart w:id="169" w:name="_Toc13459"/>
-      <w:bookmarkStart w:id="170" w:name="_Toc8252"/>
-      <w:bookmarkStart w:id="171" w:name="_Toc28804"/>
-      <w:bookmarkStart w:id="172" w:name="_Toc18508"/>
-      <w:bookmarkStart w:id="173" w:name="_Toc11069"/>
-      <w:bookmarkStart w:id="174" w:name="_Toc8509"/>
-      <w:bookmarkStart w:id="175" w:name="_Toc564"/>
-      <w:bookmarkStart w:id="176" w:name="_Toc454"/>
-      <w:bookmarkStart w:id="177" w:name="_Toc20652"/>
-      <w:bookmarkStart w:id="178" w:name="_Toc27332"/>
+      <w:bookmarkStart w:id="168" w:name="_Toc11069"/>
+      <w:bookmarkStart w:id="169" w:name="_Toc8509"/>
+      <w:bookmarkStart w:id="170" w:name="_Toc564"/>
+      <w:bookmarkStart w:id="171" w:name="_Toc454"/>
+      <w:bookmarkStart w:id="172" w:name="_Toc20652"/>
+      <w:bookmarkStart w:id="173" w:name="_Toc27332"/>
+      <w:bookmarkStart w:id="174" w:name="_Toc8252"/>
+      <w:bookmarkStart w:id="175" w:name="_Toc13459"/>
+      <w:bookmarkStart w:id="176" w:name="_Toc21652"/>
+      <w:bookmarkStart w:id="177" w:name="_Toc28804"/>
+      <w:bookmarkStart w:id="178" w:name="_Toc18508"/>
       <w:bookmarkStart w:id="179" w:name="_Toc25098"/>
       <w:r>
         <w:rPr>
@@ -10889,12 +11354,12 @@
                   <v:path/>
                   <v:fill on="f" focussize="0,0"/>
                   <v:stroke on="f" joinstyle="miter"/>
-                  <v:imagedata r:id="rId23" o:title=""/>
+                  <v:imagedata r:id="rId25" o:title=""/>
                   <o:lock v:ext="edit" aspectratio="f"/>
                   <w10:wrap type="none"/>
                   <w10:anchorlock/>
                 </v:shape>
-                <o:OLEObject Type="Embed" ProgID="Equation.DSMT4" ShapeID="_x0000_i1025" DrawAspect="Content" ObjectID="_1468075725" r:id="rId22">
+                <o:OLEObject Type="Embed" ProgID="Equation.DSMT4" ShapeID="_x0000_i1025" DrawAspect="Content" ObjectID="_1468075725" r:id="rId24">
                   <o:LockedField>false</o:LockedField>
                 </o:OLEObject>
               </w:object>
@@ -10963,12 +11428,12 @@
             <v:path/>
             <v:fill on="f" focussize="0,0"/>
             <v:stroke on="f" joinstyle="miter"/>
-            <v:imagedata r:id="rId25" o:title=""/>
+            <v:imagedata r:id="rId27" o:title=""/>
             <o:lock v:ext="edit" aspectratio="f"/>
             <w10:wrap type="none"/>
             <w10:anchorlock/>
           </v:shape>
-          <o:OLEObject Type="Embed" ProgID="Equation.DSMT4" ShapeID="_x0000_i1026" DrawAspect="Content" ObjectID="_1468075726" r:id="rId24">
+          <o:OLEObject Type="Embed" ProgID="Equation.DSMT4" ShapeID="_x0000_i1026" DrawAspect="Content" ObjectID="_1468075726" r:id="rId26">
             <o:LockedField>false</o:LockedField>
           </o:OLEObject>
         </w:object>
@@ -10989,12 +11454,12 @@
             <v:path/>
             <v:fill on="f" focussize="0,0"/>
             <v:stroke on="f" joinstyle="miter"/>
-            <v:imagedata r:id="rId27" o:title=""/>
+            <v:imagedata r:id="rId29" o:title=""/>
             <o:lock v:ext="edit" aspectratio="f"/>
             <w10:wrap type="none"/>
             <w10:anchorlock/>
           </v:shape>
-          <o:OLEObject Type="Embed" ProgID="Equation.DSMT4" ShapeID="_x0000_i1027" DrawAspect="Content" ObjectID="_1468075727" r:id="rId26">
+          <o:OLEObject Type="Embed" ProgID="Equation.DSMT4" ShapeID="_x0000_i1027" DrawAspect="Content" ObjectID="_1468075727" r:id="rId28">
             <o:LockedField>false</o:LockedField>
           </o:OLEObject>
         </w:object>
@@ -11156,12 +11621,12 @@
                   <v:path/>
                   <v:fill on="f" focussize="0,0"/>
                   <v:stroke on="f" joinstyle="miter"/>
-                  <v:imagedata r:id="rId29" o:title=""/>
+                  <v:imagedata r:id="rId31" o:title=""/>
                   <o:lock v:ext="edit" aspectratio="f"/>
                   <w10:wrap type="none"/>
                   <w10:anchorlock/>
                 </v:shape>
-                <o:OLEObject Type="Embed" ProgID="Equation.DSMT4" ShapeID="_x0000_i1028" DrawAspect="Content" ObjectID="_1468075728" r:id="rId28">
+                <o:OLEObject Type="Embed" ProgID="Equation.DSMT4" ShapeID="_x0000_i1028" DrawAspect="Content" ObjectID="_1468075728" r:id="rId30">
                   <o:LockedField>false</o:LockedField>
                 </o:OLEObject>
               </w:object>
@@ -11245,12 +11710,12 @@
             <v:path/>
             <v:fill on="f" focussize="0,0"/>
             <v:stroke on="f" joinstyle="miter"/>
-            <v:imagedata r:id="rId31" o:title=""/>
+            <v:imagedata r:id="rId33" o:title=""/>
             <o:lock v:ext="edit" aspectratio="f"/>
             <w10:wrap type="none"/>
             <w10:anchorlock/>
           </v:shape>
-          <o:OLEObject Type="Embed" ProgID="Equation.DSMT4" ShapeID="_x0000_i1029" DrawAspect="Content" ObjectID="_1468075729" r:id="rId30">
+          <o:OLEObject Type="Embed" ProgID="Equation.DSMT4" ShapeID="_x0000_i1029" DrawAspect="Content" ObjectID="_1468075729" r:id="rId32">
             <o:LockedField>false</o:LockedField>
           </o:OLEObject>
         </w:object>
@@ -11273,12 +11738,12 @@
             <v:path/>
             <v:fill on="f" focussize="0,0"/>
             <v:stroke on="f" joinstyle="miter"/>
-            <v:imagedata r:id="rId33" o:title=""/>
+            <v:imagedata r:id="rId35" o:title=""/>
             <o:lock v:ext="edit" aspectratio="f"/>
             <w10:wrap type="none"/>
             <w10:anchorlock/>
           </v:shape>
-          <o:OLEObject Type="Embed" ProgID="Equation.DSMT4" ShapeID="_x0000_i1030" DrawAspect="Content" ObjectID="_1468075730" r:id="rId32">
+          <o:OLEObject Type="Embed" ProgID="Equation.DSMT4" ShapeID="_x0000_i1030" DrawAspect="Content" ObjectID="_1468075730" r:id="rId34">
             <o:LockedField>false</o:LockedField>
           </o:OLEObject>
         </w:object>
@@ -11360,12 +11825,12 @@
                   <v:path/>
                   <v:fill on="f" focussize="0,0"/>
                   <v:stroke on="f" joinstyle="miter"/>
-                  <v:imagedata r:id="rId35" o:title=""/>
+                  <v:imagedata r:id="rId37" o:title=""/>
                   <o:lock v:ext="edit" aspectratio="f"/>
                   <w10:wrap type="none"/>
                   <w10:anchorlock/>
                 </v:shape>
-                <o:OLEObject Type="Embed" ProgID="Equation.DSMT4" ShapeID="_x0000_i1031" DrawAspect="Content" ObjectID="_1468075731" r:id="rId34">
+                <o:OLEObject Type="Embed" ProgID="Equation.DSMT4" ShapeID="_x0000_i1031" DrawAspect="Content" ObjectID="_1468075731" r:id="rId36">
                   <o:LockedField>false</o:LockedField>
                 </o:OLEObject>
               </w:object>
@@ -11432,12 +11897,12 @@
             <v:path/>
             <v:fill on="f" focussize="0,0"/>
             <v:stroke on="f" joinstyle="miter"/>
-            <v:imagedata r:id="rId37" o:title=""/>
+            <v:imagedata r:id="rId39" o:title=""/>
             <o:lock v:ext="edit" aspectratio="f"/>
             <w10:wrap type="none"/>
             <w10:anchorlock/>
           </v:shape>
-          <o:OLEObject Type="Embed" ProgID="Equation.DSMT4" ShapeID="_x0000_i1032" DrawAspect="Content" ObjectID="_1468075732" r:id="rId36">
+          <o:OLEObject Type="Embed" ProgID="Equation.DSMT4" ShapeID="_x0000_i1032" DrawAspect="Content" ObjectID="_1468075732" r:id="rId38">
             <o:LockedField>false</o:LockedField>
           </o:OLEObject>
         </w:object>
@@ -11458,12 +11923,12 @@
             <v:path/>
             <v:fill on="f" focussize="0,0"/>
             <v:stroke on="f" joinstyle="miter"/>
-            <v:imagedata r:id="rId39" o:title=""/>
+            <v:imagedata r:id="rId41" o:title=""/>
             <o:lock v:ext="edit" aspectratio="f"/>
             <w10:wrap type="none"/>
             <w10:anchorlock/>
           </v:shape>
-          <o:OLEObject Type="Embed" ProgID="Equation.DSMT4" ShapeID="_x0000_i1033" DrawAspect="Content" ObjectID="_1468075733" r:id="rId38">
+          <o:OLEObject Type="Embed" ProgID="Equation.DSMT4" ShapeID="_x0000_i1033" DrawAspect="Content" ObjectID="_1468075733" r:id="rId40">
             <o:LockedField>false</o:LockedField>
           </o:OLEObject>
         </w:object>
@@ -11481,18 +11946,18 @@
         <w:bidi w:val="0"/>
       </w:pPr>
       <w:bookmarkStart w:id="180" w:name="_Toc7077609"/>
-      <w:bookmarkStart w:id="181" w:name="_Toc4910"/>
-      <w:bookmarkStart w:id="182" w:name="_Toc21575"/>
-      <w:bookmarkStart w:id="183" w:name="_Toc26959"/>
-      <w:bookmarkStart w:id="184" w:name="_Toc30757"/>
-      <w:bookmarkStart w:id="185" w:name="_Toc5374"/>
-      <w:bookmarkStart w:id="186" w:name="_Toc1954"/>
-      <w:bookmarkStart w:id="187" w:name="_Toc2904"/>
-      <w:bookmarkStart w:id="188" w:name="_Toc32705"/>
-      <w:bookmarkStart w:id="189" w:name="_Toc6709"/>
-      <w:bookmarkStart w:id="190" w:name="_Toc15329"/>
-      <w:bookmarkStart w:id="191" w:name="_Toc10024"/>
-      <w:bookmarkStart w:id="192" w:name="_Toc27827"/>
+      <w:bookmarkStart w:id="181" w:name="_Toc21575"/>
+      <w:bookmarkStart w:id="182" w:name="_Toc32705"/>
+      <w:bookmarkStart w:id="183" w:name="_Toc15329"/>
+      <w:bookmarkStart w:id="184" w:name="_Toc27827"/>
+      <w:bookmarkStart w:id="185" w:name="_Toc4910"/>
+      <w:bookmarkStart w:id="186" w:name="_Toc2904"/>
+      <w:bookmarkStart w:id="187" w:name="_Toc6709"/>
+      <w:bookmarkStart w:id="188" w:name="_Toc30757"/>
+      <w:bookmarkStart w:id="189" w:name="_Toc1954"/>
+      <w:bookmarkStart w:id="190" w:name="_Toc10024"/>
+      <w:bookmarkStart w:id="191" w:name="_Toc26959"/>
+      <w:bookmarkStart w:id="192" w:name="_Toc5374"/>
       <w:r>
         <w:rPr>
           <w:rFonts w:hint="eastAsia"/>
@@ -11596,12 +12061,12 @@
             <v:path/>
             <v:fill on="f" focussize="0,0"/>
             <v:stroke on="f" joinstyle="miter"/>
-            <v:imagedata r:id="rId41" o:title=""/>
+            <v:imagedata r:id="rId43" o:title=""/>
             <o:lock v:ext="edit" aspectratio="f"/>
             <w10:wrap type="none"/>
             <w10:anchorlock/>
           </v:shape>
-          <o:OLEObject Type="Embed" ProgID="Equation.DSMT4" ShapeID="_x0000_i1034" DrawAspect="Content" ObjectID="_1468075734" r:id="rId40">
+          <o:OLEObject Type="Embed" ProgID="Equation.DSMT4" ShapeID="_x0000_i1034" DrawAspect="Content" ObjectID="_1468075734" r:id="rId42">
             <o:LockedField>false</o:LockedField>
           </o:OLEObject>
         </w:object>
@@ -11679,12 +12144,12 @@
                   <v:path/>
                   <v:fill on="f" focussize="0,0"/>
                   <v:stroke on="f" joinstyle="miter"/>
-                  <v:imagedata r:id="rId43" o:title=""/>
+                  <v:imagedata r:id="rId45" o:title=""/>
                   <o:lock v:ext="edit" aspectratio="f"/>
                   <w10:wrap type="none"/>
                   <w10:anchorlock/>
                 </v:shape>
-                <o:OLEObject Type="Embed" ProgID="Equation.DSMT4" ShapeID="_x0000_i1035" DrawAspect="Content" ObjectID="_1468075735" r:id="rId42">
+                <o:OLEObject Type="Embed" ProgID="Equation.DSMT4" ShapeID="_x0000_i1035" DrawAspect="Content" ObjectID="_1468075735" r:id="rId44">
                   <o:LockedField>false</o:LockedField>
                 </o:OLEObject>
               </w:object>
@@ -11742,12 +12207,12 @@
             <v:path/>
             <v:fill on="f" focussize="0,0"/>
             <v:stroke on="f" joinstyle="miter"/>
-            <v:imagedata r:id="rId45" o:title=""/>
+            <v:imagedata r:id="rId47" o:title=""/>
             <o:lock v:ext="edit" aspectratio="f"/>
             <w10:wrap type="none"/>
             <w10:anchorlock/>
           </v:shape>
-          <o:OLEObject Type="Embed" ProgID="Equation.DSMT4" ShapeID="_x0000_i1036" DrawAspect="Content" ObjectID="_1468075736" r:id="rId44">
+          <o:OLEObject Type="Embed" ProgID="Equation.DSMT4" ShapeID="_x0000_i1036" DrawAspect="Content" ObjectID="_1468075736" r:id="rId46">
             <o:LockedField>false</o:LockedField>
           </o:OLEObject>
         </w:object>
@@ -11826,12 +12291,12 @@
                   <v:path/>
                   <v:fill on="f" focussize="0,0"/>
                   <v:stroke on="f" joinstyle="miter"/>
-                  <v:imagedata r:id="rId47" o:title=""/>
+                  <v:imagedata r:id="rId49" o:title=""/>
                   <o:lock v:ext="edit" aspectratio="f"/>
                   <w10:wrap type="none"/>
                   <w10:anchorlock/>
                 </v:shape>
-                <o:OLEObject Type="Embed" ProgID="Equation.DSMT4" ShapeID="_x0000_i1037" DrawAspect="Content" ObjectID="_1468075737" r:id="rId46">
+                <o:OLEObject Type="Embed" ProgID="Equation.DSMT4" ShapeID="_x0000_i1037" DrawAspect="Content" ObjectID="_1468075737" r:id="rId48">
                   <o:LockedField>false</o:LockedField>
                 </o:OLEObject>
               </w:object>
@@ -11976,12 +12441,12 @@
                   <v:path/>
                   <v:fill on="f" focussize="0,0"/>
                   <v:stroke on="f" joinstyle="miter"/>
-                  <v:imagedata r:id="rId49" o:title=""/>
+                  <v:imagedata r:id="rId51" o:title=""/>
                   <o:lock v:ext="edit" aspectratio="f"/>
                   <w10:wrap type="none"/>
                   <w10:anchorlock/>
                 </v:shape>
-                <o:OLEObject Type="Embed" ProgID="Equation.DSMT4" ShapeID="_x0000_i1038" DrawAspect="Content" ObjectID="_1468075738" r:id="rId48">
+                <o:OLEObject Type="Embed" ProgID="Equation.DSMT4" ShapeID="_x0000_i1038" DrawAspect="Content" ObjectID="_1468075738" r:id="rId50">
                   <o:LockedField>false</o:LockedField>
                 </o:OLEObject>
               </w:object>
@@ -12039,47 +12504,25 @@
             <v:path/>
             <v:fill on="f" focussize="0,0"/>
             <v:stroke on="f" joinstyle="miter"/>
-            <v:imagedata r:id="rId51" o:title=""/>
-            <o:lock v:ext="edit" aspectratio="f"/>
-            <w10:wrap type="none"/>
-            <w10:anchorlock/>
-          </v:shape>
-          <o:OLEObject Type="Embed" ProgID="Equation.DSMT4" ShapeID="_x0000_i1039" DrawAspect="Content" ObjectID="_1468075739" r:id="rId50">
-            <o:LockedField>false</o:LockedField>
-          </o:OLEObject>
-        </w:object>
-      </w:r>
-      <w:r>
-        <w:t xml:space="preserve"> 为块嵌入矩阵（</w:t>
-      </w:r>
-      <w:r>
-        <w:rPr>
-          <w:position w:val="-4"/>
-        </w:rPr>
-        <w:object>
-          <v:shape id="_x0000_i1040" o:spt="75" type="#_x0000_t75" style="height:13.15pt;width:12pt;" o:ole="t" filled="f" o:preferrelative="t" stroked="f" coordsize="21600,21600">
-            <v:path/>
-            <v:fill on="f" focussize="0,0"/>
-            <v:stroke on="f" joinstyle="miter"/>
             <v:imagedata r:id="rId53" o:title=""/>
             <o:lock v:ext="edit" aspectratio="f"/>
             <w10:wrap type="none"/>
             <w10:anchorlock/>
           </v:shape>
-          <o:OLEObject Type="Embed" ProgID="Equation.DSMT4" ShapeID="_x0000_i1040" DrawAspect="Content" ObjectID="_1468075740" r:id="rId52">
+          <o:OLEObject Type="Embed" ProgID="Equation.DSMT4" ShapeID="_x0000_i1039" DrawAspect="Content" ObjectID="_1468075739" r:id="rId52">
             <o:LockedField>false</o:LockedField>
           </o:OLEObject>
         </w:object>
       </w:r>
       <w:r>
-        <w:t>为块大小），</w:t>
-      </w:r>
-      <w:r>
-        <w:rPr>
-          <w:position w:val="-14"/>
+        <w:t xml:space="preserve"> 为块嵌入矩阵（</w:t>
+      </w:r>
+      <w:r>
+        <w:rPr>
+          <w:position w:val="-4"/>
         </w:rPr>
         <w:object>
-          <v:shape id="_x0000_i1041" o:spt="75" type="#_x0000_t75" style="height:19.9pt;width:70.1pt;" o:ole="t" filled="f" o:preferrelative="t" stroked="f" coordsize="21600,21600">
+          <v:shape id="_x0000_i1040" o:spt="75" type="#_x0000_t75" style="height:13.15pt;width:12pt;" o:ole="t" filled="f" o:preferrelative="t" stroked="f" coordsize="21600,21600">
             <v:path/>
             <v:fill on="f" focussize="0,0"/>
             <v:stroke on="f" joinstyle="miter"/>
@@ -12088,7 +12531,29 @@
             <w10:wrap type="none"/>
             <w10:anchorlock/>
           </v:shape>
-          <o:OLEObject Type="Embed" ProgID="Equation.DSMT4" ShapeID="_x0000_i1041" DrawAspect="Content" ObjectID="_1468075741" r:id="rId54">
+          <o:OLEObject Type="Embed" ProgID="Equation.DSMT4" ShapeID="_x0000_i1040" DrawAspect="Content" ObjectID="_1468075740" r:id="rId54">
+            <o:LockedField>false</o:LockedField>
+          </o:OLEObject>
+        </w:object>
+      </w:r>
+      <w:r>
+        <w:t>为块大小），</w:t>
+      </w:r>
+      <w:r>
+        <w:rPr>
+          <w:position w:val="-14"/>
+        </w:rPr>
+        <w:object>
+          <v:shape id="_x0000_i1041" o:spt="75" type="#_x0000_t75" style="height:19.9pt;width:70.1pt;" o:ole="t" filled="f" o:preferrelative="t" stroked="f" coordsize="21600,21600">
+            <v:path/>
+            <v:fill on="f" focussize="0,0"/>
+            <v:stroke on="f" joinstyle="miter"/>
+            <v:imagedata r:id="rId57" o:title=""/>
+            <o:lock v:ext="edit" aspectratio="f"/>
+            <w10:wrap type="none"/>
+            <w10:anchorlock/>
+          </v:shape>
+          <o:OLEObject Type="Embed" ProgID="Equation.DSMT4" ShapeID="_x0000_i1041" DrawAspect="Content" ObjectID="_1468075741" r:id="rId56">
             <o:LockedField>false</o:LockedField>
           </o:OLEObject>
         </w:object>
@@ -12189,12 +12654,12 @@
                   <v:path/>
                   <v:fill on="f" focussize="0,0"/>
                   <v:stroke on="f" joinstyle="miter"/>
-                  <v:imagedata r:id="rId57" o:title=""/>
+                  <v:imagedata r:id="rId59" o:title=""/>
                   <o:lock v:ext="edit" aspectratio="f"/>
                   <w10:wrap type="none"/>
                   <w10:anchorlock/>
                 </v:shape>
-                <o:OLEObject Type="Embed" ProgID="Equation.DSMT4" ShapeID="_x0000_i1042" DrawAspect="Content" ObjectID="_1468075742" r:id="rId56">
+                <o:OLEObject Type="Embed" ProgID="Equation.DSMT4" ShapeID="_x0000_i1042" DrawAspect="Content" ObjectID="_1468075742" r:id="rId58">
                   <o:LockedField>false</o:LockedField>
                 </o:OLEObject>
               </w:object>
@@ -12252,12 +12717,12 @@
             <v:path/>
             <v:fill on="f" focussize="0,0"/>
             <v:stroke on="f" joinstyle="miter"/>
-            <v:imagedata r:id="rId59" o:title=""/>
+            <v:imagedata r:id="rId61" o:title=""/>
             <o:lock v:ext="edit" aspectratio="f"/>
             <w10:wrap type="none"/>
             <w10:anchorlock/>
           </v:shape>
-          <o:OLEObject Type="Embed" ProgID="Equation.DSMT4" ShapeID="_x0000_i1043" DrawAspect="Content" ObjectID="_1468075743" r:id="rId58">
+          <o:OLEObject Type="Embed" ProgID="Equation.DSMT4" ShapeID="_x0000_i1043" DrawAspect="Content" ObjectID="_1468075743" r:id="rId60">
             <o:LockedField>false</o:LockedField>
           </o:OLEObject>
         </w:object>
@@ -12274,12 +12739,12 @@
             <v:path/>
             <v:fill on="f" focussize="0,0"/>
             <v:stroke on="f" joinstyle="miter"/>
-            <v:imagedata r:id="rId61" o:title=""/>
+            <v:imagedata r:id="rId63" o:title=""/>
             <o:lock v:ext="edit" aspectratio="f"/>
             <w10:wrap type="none"/>
             <w10:anchorlock/>
           </v:shape>
-          <o:OLEObject Type="Embed" ProgID="Equation.DSMT4" ShapeID="_x0000_i1044" DrawAspect="Content" ObjectID="_1468075744" r:id="rId60">
+          <o:OLEObject Type="Embed" ProgID="Equation.DSMT4" ShapeID="_x0000_i1044" DrawAspect="Content" ObjectID="_1468075744" r:id="rId62">
             <o:LockedField>false</o:LockedField>
           </o:OLEObject>
         </w:object>
@@ -12373,17 +12838,17 @@
         <w:bidi w:val="0"/>
       </w:pPr>
       <w:bookmarkStart w:id="193" w:name="_Toc3871"/>
-      <w:bookmarkStart w:id="194" w:name="_Toc18582"/>
-      <w:bookmarkStart w:id="195" w:name="_Toc26693"/>
-      <w:bookmarkStart w:id="196" w:name="_Toc28270"/>
-      <w:bookmarkStart w:id="197" w:name="_Toc8292"/>
-      <w:bookmarkStart w:id="198" w:name="_Toc29765"/>
-      <w:bookmarkStart w:id="199" w:name="_Toc800"/>
-      <w:bookmarkStart w:id="200" w:name="_Toc22001"/>
-      <w:bookmarkStart w:id="201" w:name="_Toc32549"/>
-      <w:bookmarkStart w:id="202" w:name="_Toc31910"/>
-      <w:bookmarkStart w:id="203" w:name="_Toc29824"/>
-      <w:bookmarkStart w:id="204" w:name="_Toc5304"/>
+      <w:bookmarkStart w:id="194" w:name="_Toc28270"/>
+      <w:bookmarkStart w:id="195" w:name="_Toc29824"/>
+      <w:bookmarkStart w:id="196" w:name="_Toc32549"/>
+      <w:bookmarkStart w:id="197" w:name="_Toc5304"/>
+      <w:bookmarkStart w:id="198" w:name="_Toc8292"/>
+      <w:bookmarkStart w:id="199" w:name="_Toc18582"/>
+      <w:bookmarkStart w:id="200" w:name="_Toc26693"/>
+      <w:bookmarkStart w:id="201" w:name="_Toc29765"/>
+      <w:bookmarkStart w:id="202" w:name="_Toc800"/>
+      <w:bookmarkStart w:id="203" w:name="_Toc22001"/>
+      <w:bookmarkStart w:id="204" w:name="_Toc31910"/>
       <w:r>
         <w:rPr>
           <w:rFonts w:hint="eastAsia"/>
@@ -12516,12 +12981,12 @@
                   <v:path/>
                   <v:fill on="f" focussize="0,0"/>
                   <v:stroke on="f" joinstyle="miter"/>
-                  <v:imagedata r:id="rId63" o:title=""/>
+                  <v:imagedata r:id="rId65" o:title=""/>
                   <o:lock v:ext="edit" aspectratio="f"/>
                   <w10:wrap type="none"/>
                   <w10:anchorlock/>
                 </v:shape>
-                <o:OLEObject Type="Embed" ProgID="Equation.DSMT4" ShapeID="_x0000_i1045" DrawAspect="Content" ObjectID="_1468075745" r:id="rId62">
+                <o:OLEObject Type="Embed" ProgID="Equation.DSMT4" ShapeID="_x0000_i1045" DrawAspect="Content" ObjectID="_1468075745" r:id="rId64">
                   <o:LockedField>false</o:LockedField>
                 </o:OLEObject>
               </w:object>
@@ -12579,12 +13044,12 @@
             <v:path/>
             <v:fill on="f" focussize="0,0"/>
             <v:stroke on="f" joinstyle="miter"/>
-            <v:imagedata r:id="rId65" o:title=""/>
+            <v:imagedata r:id="rId67" o:title=""/>
             <o:lock v:ext="edit" aspectratio="f"/>
             <w10:wrap type="none"/>
             <w10:anchorlock/>
           </v:shape>
-          <o:OLEObject Type="Embed" ProgID="Equation.DSMT4" ShapeID="_x0000_i1046" DrawAspect="Content" ObjectID="_1468075746" r:id="rId64">
+          <o:OLEObject Type="Embed" ProgID="Equation.DSMT4" ShapeID="_x0000_i1046" DrawAspect="Content" ObjectID="_1468075746" r:id="rId66">
             <o:LockedField>false</o:LockedField>
           </o:OLEObject>
         </w:object>
@@ -12662,12 +13127,12 @@
                   <v:path/>
                   <v:fill on="f" focussize="0,0"/>
                   <v:stroke on="f" joinstyle="miter"/>
-                  <v:imagedata r:id="rId67" o:title=""/>
+                  <v:imagedata r:id="rId69" o:title=""/>
                   <o:lock v:ext="edit" aspectratio="f"/>
                   <w10:wrap type="none"/>
                   <w10:anchorlock/>
                 </v:shape>
-                <o:OLEObject Type="Embed" ProgID="Equation.DSMT4" ShapeID="_x0000_i1047" DrawAspect="Content" ObjectID="_1468075747" r:id="rId66">
+                <o:OLEObject Type="Embed" ProgID="Equation.DSMT4" ShapeID="_x0000_i1047" DrawAspect="Content" ObjectID="_1468075747" r:id="rId68">
                   <o:LockedField>false</o:LockedField>
                 </o:OLEObject>
               </w:object>
@@ -12725,73 +13190,25 @@
             <v:path/>
             <v:fill on="f" focussize="0,0"/>
             <v:stroke on="f" joinstyle="miter"/>
-            <v:imagedata r:id="rId69" o:title=""/>
-            <o:lock v:ext="edit" aspectratio="f"/>
-            <w10:wrap type="none"/>
-            <w10:anchorlock/>
-          </v:shape>
-          <o:OLEObject Type="Embed" ProgID="Equation.DSMT4" ShapeID="_x0000_i1048" DrawAspect="Content" ObjectID="_1468075748" r:id="rId68">
-            <o:LockedField>false</o:LockedField>
-          </o:OLEObject>
-        </w:object>
-      </w:r>
-      <w:r>
-        <w:t>为文本序列长度，</w:t>
-      </w:r>
-      <w:r>
-        <w:rPr>
-          <w:position w:val="-12"/>
-        </w:rPr>
-        <w:object>
-          <v:shape id="_x0000_i1049" o:spt="75" type="#_x0000_t75" style="height:18pt;width:22.15pt;" o:ole="t" filled="f" o:preferrelative="t" stroked="f" coordsize="21600,21600">
-            <v:path/>
-            <v:fill on="f" focussize="0,0"/>
-            <v:stroke on="f" joinstyle="miter"/>
             <v:imagedata r:id="rId71" o:title=""/>
             <o:lock v:ext="edit" aspectratio="f"/>
             <w10:wrap type="none"/>
             <w10:anchorlock/>
           </v:shape>
-          <o:OLEObject Type="Embed" ProgID="Equation.DSMT4" ShapeID="_x0000_i1049" DrawAspect="Content" ObjectID="_1468075749" r:id="rId70">
+          <o:OLEObject Type="Embed" ProgID="Equation.DSMT4" ShapeID="_x0000_i1048" DrawAspect="Content" ObjectID="_1468075748" r:id="rId70">
             <o:LockedField>false</o:LockedField>
           </o:OLEObject>
         </w:object>
       </w:r>
       <w:r>
-        <w:t>为词嵌入维度。双流设计使模型能够独立处理不同模态的输入。</w:t>
-      </w:r>
-    </w:p>
-    <w:p>
-      <w:pPr>
-        <w:ind w:firstLine="516" w:firstLineChars="200"/>
-      </w:pPr>
-      <w:r>
-        <w:t>2</w:t>
-      </w:r>
-      <w:r>
-        <w:rPr>
-          <w:rFonts w:hint="eastAsia"/>
-          <w:lang w:val="en-US" w:eastAsia="zh-CN"/>
-        </w:rPr>
-        <w:t>.</w:t>
-      </w:r>
-      <w:r>
-        <w:t xml:space="preserve">对比学习目标  </w:t>
-      </w:r>
-    </w:p>
-    <w:p>
-      <w:pPr>
-        <w:ind w:firstLine="516" w:firstLineChars="200"/>
-      </w:pPr>
-      <w:r>
-        <w:t>CLIP通过最大化匹配图文对的相似度，最小化非匹配对的相似度，实现跨模态对齐。给定批次内</w:t>
-      </w:r>
-      <w:r>
-        <w:rPr>
-          <w:position w:val="-6"/>
+        <w:t>为文本序列长度，</w:t>
+      </w:r>
+      <w:r>
+        <w:rPr>
+          <w:position w:val="-12"/>
         </w:rPr>
         <w:object>
-          <v:shape id="_x0000_i1050" o:spt="75" type="#_x0000_t75" style="height:13.9pt;width:13.9pt;" o:ole="t" filled="f" o:preferrelative="t" stroked="f" coordsize="21600,21600">
+          <v:shape id="_x0000_i1049" o:spt="75" type="#_x0000_t75" style="height:18pt;width:22.15pt;" o:ole="t" filled="f" o:preferrelative="t" stroked="f" coordsize="21600,21600">
             <v:path/>
             <v:fill on="f" focussize="0,0"/>
             <v:stroke on="f" joinstyle="miter"/>
@@ -12800,7 +13217,55 @@
             <w10:wrap type="none"/>
             <w10:anchorlock/>
           </v:shape>
-          <o:OLEObject Type="Embed" ProgID="Equation.DSMT4" ShapeID="_x0000_i1050" DrawAspect="Content" ObjectID="_1468075750" r:id="rId72">
+          <o:OLEObject Type="Embed" ProgID="Equation.DSMT4" ShapeID="_x0000_i1049" DrawAspect="Content" ObjectID="_1468075749" r:id="rId72">
+            <o:LockedField>false</o:LockedField>
+          </o:OLEObject>
+        </w:object>
+      </w:r>
+      <w:r>
+        <w:t>为词嵌入维度。双流设计使模型能够独立处理不同模态的输入。</w:t>
+      </w:r>
+    </w:p>
+    <w:p>
+      <w:pPr>
+        <w:ind w:firstLine="516" w:firstLineChars="200"/>
+      </w:pPr>
+      <w:r>
+        <w:t>2</w:t>
+      </w:r>
+      <w:r>
+        <w:rPr>
+          <w:rFonts w:hint="eastAsia"/>
+          <w:lang w:val="en-US" w:eastAsia="zh-CN"/>
+        </w:rPr>
+        <w:t>.</w:t>
+      </w:r>
+      <w:r>
+        <w:t xml:space="preserve">对比学习目标  </w:t>
+      </w:r>
+    </w:p>
+    <w:p>
+      <w:pPr>
+        <w:ind w:firstLine="516" w:firstLineChars="200"/>
+      </w:pPr>
+      <w:r>
+        <w:t>CLIP通过最大化匹配图文对的相似度，最小化非匹配对的相似度，实现跨模态对齐。给定批次内</w:t>
+      </w:r>
+      <w:r>
+        <w:rPr>
+          <w:position w:val="-6"/>
+        </w:rPr>
+        <w:object>
+          <v:shape id="_x0000_i1050" o:spt="75" type="#_x0000_t75" style="height:13.9pt;width:13.9pt;" o:ole="t" filled="f" o:preferrelative="t" stroked="f" coordsize="21600,21600">
+            <v:path/>
+            <v:fill on="f" focussize="0,0"/>
+            <v:stroke on="f" joinstyle="miter"/>
+            <v:imagedata r:id="rId75" o:title=""/>
+            <o:lock v:ext="edit" aspectratio="f"/>
+            <w10:wrap type="none"/>
+            <w10:anchorlock/>
+          </v:shape>
+          <o:OLEObject Type="Embed" ProgID="Equation.DSMT4" ShapeID="_x0000_i1050" DrawAspect="Content" ObjectID="_1468075750" r:id="rId74">
             <o:LockedField>false</o:LockedField>
           </o:OLEObject>
         </w:object>
@@ -12879,12 +13344,12 @@
                   <v:path/>
                   <v:fill on="f" focussize="0,0"/>
                   <v:stroke on="f" joinstyle="miter"/>
-                  <v:imagedata r:id="rId75" o:title=""/>
+                  <v:imagedata r:id="rId77" o:title=""/>
                   <o:lock v:ext="edit" aspectratio="f"/>
                   <w10:wrap type="none"/>
                   <w10:anchorlock/>
                 </v:shape>
-                <o:OLEObject Type="Embed" ProgID="Equation.DSMT4" ShapeID="_x0000_i1051" DrawAspect="Content" ObjectID="_1468075751" r:id="rId74">
+                <o:OLEObject Type="Embed" ProgID="Equation.DSMT4" ShapeID="_x0000_i1051" DrawAspect="Content" ObjectID="_1468075751" r:id="rId76">
                   <o:LockedField>false</o:LockedField>
                 </o:OLEObject>
               </w:object>
@@ -12942,12 +13407,12 @@
             <v:path/>
             <v:fill on="f" focussize="0,0"/>
             <v:stroke on="f" joinstyle="miter"/>
-            <v:imagedata r:id="rId77" o:title=""/>
+            <v:imagedata r:id="rId79" o:title=""/>
             <o:lock v:ext="edit" aspectratio="f"/>
             <w10:wrap type="none"/>
             <w10:anchorlock/>
           </v:shape>
-          <o:OLEObject Type="Embed" ProgID="Equation.DSMT4" ShapeID="_x0000_i1052" DrawAspect="Content" ObjectID="_1468075752" r:id="rId76">
+          <o:OLEObject Type="Embed" ProgID="Equation.DSMT4" ShapeID="_x0000_i1052" DrawAspect="Content" ObjectID="_1468075752" r:id="rId78">
             <o:LockedField>false</o:LockedField>
           </o:OLEObject>
         </w:object>
@@ -13099,13 +13564,13 @@
       <w:bookmarkStart w:id="207" w:name="_Toc3595"/>
       <w:bookmarkStart w:id="208" w:name="_Toc30543"/>
       <w:bookmarkStart w:id="209" w:name="_Toc29647"/>
-      <w:bookmarkStart w:id="210" w:name="_Toc8709"/>
-      <w:bookmarkStart w:id="211" w:name="_Toc29274"/>
-      <w:bookmarkStart w:id="212" w:name="_Toc1092"/>
-      <w:bookmarkStart w:id="213" w:name="_Toc28671"/>
-      <w:bookmarkStart w:id="214" w:name="_Toc10631"/>
-      <w:bookmarkStart w:id="215" w:name="_Toc7077610"/>
-      <w:bookmarkStart w:id="216" w:name="_Toc30268"/>
+      <w:bookmarkStart w:id="210" w:name="_Toc28671"/>
+      <w:bookmarkStart w:id="211" w:name="_Toc8709"/>
+      <w:bookmarkStart w:id="212" w:name="_Toc29274"/>
+      <w:bookmarkStart w:id="213" w:name="_Toc7077610"/>
+      <w:bookmarkStart w:id="214" w:name="_Toc1092"/>
+      <w:bookmarkStart w:id="215" w:name="_Toc30268"/>
+      <w:bookmarkStart w:id="216" w:name="_Toc10631"/>
       <w:bookmarkStart w:id="217" w:name="_Toc22050"/>
       <w:r>
         <w:rPr>
@@ -13160,6 +13625,7 @@
         <w:keepLines w:val="0"/>
         <w:widowControl/>
         <w:numPr>
+          <w:ilvl w:val="0"/>
           <w:numId w:val="0"/>
         </w:numPr>
         <w:suppressLineNumbers w:val="0"/>
@@ -13187,9 +13653,6 @@
         <w:t xml:space="preserve">2.2.2 </w:t>
       </w:r>
       <w:r>
-        <w:rPr>
-          <w:bdr w:val="none" w:color="auto" w:sz="0" w:space="0"/>
-        </w:rPr>
         <w:t>滑动窗口机制与局部特征建模</w:t>
       </w:r>
     </w:p>
@@ -13380,15 +13843,15 @@
       <w:bookmarkStart w:id="218" w:name="_Toc25642"/>
       <w:bookmarkStart w:id="219" w:name="_Toc30564"/>
       <w:bookmarkStart w:id="220" w:name="_Toc23677"/>
-      <w:bookmarkStart w:id="221" w:name="_Toc7610"/>
-      <w:bookmarkStart w:id="222" w:name="_Toc28416"/>
-      <w:bookmarkStart w:id="223" w:name="_Toc625"/>
-      <w:bookmarkStart w:id="224" w:name="_Toc7082"/>
-      <w:bookmarkStart w:id="225" w:name="_Toc21669"/>
-      <w:bookmarkStart w:id="226" w:name="_Toc29836"/>
-      <w:bookmarkStart w:id="227" w:name="_Toc14344"/>
-      <w:bookmarkStart w:id="228" w:name="_Toc9056"/>
-      <w:bookmarkStart w:id="229" w:name="_Toc30642"/>
+      <w:bookmarkStart w:id="221" w:name="_Toc7082"/>
+      <w:bookmarkStart w:id="222" w:name="_Toc29836"/>
+      <w:bookmarkStart w:id="223" w:name="_Toc28416"/>
+      <w:bookmarkStart w:id="224" w:name="_Toc30642"/>
+      <w:bookmarkStart w:id="225" w:name="_Toc625"/>
+      <w:bookmarkStart w:id="226" w:name="_Toc14344"/>
+      <w:bookmarkStart w:id="227" w:name="_Toc9056"/>
+      <w:bookmarkStart w:id="228" w:name="_Toc21669"/>
+      <w:bookmarkStart w:id="229" w:name="_Toc7610"/>
       <w:r>
         <w:rPr>
           <w:rFonts w:hint="eastAsia"/>
@@ -13432,18 +13895,18 @@
         <w:pStyle w:val="5"/>
         <w:bidi w:val="0"/>
       </w:pPr>
-      <w:bookmarkStart w:id="230" w:name="_Toc14529"/>
-      <w:bookmarkStart w:id="231" w:name="_Toc21872"/>
-      <w:bookmarkStart w:id="232" w:name="_Toc20883"/>
-      <w:bookmarkStart w:id="233" w:name="_Toc9868"/>
-      <w:bookmarkStart w:id="234" w:name="_Toc5992"/>
-      <w:bookmarkStart w:id="235" w:name="_Toc16317"/>
-      <w:bookmarkStart w:id="236" w:name="_Toc1239"/>
-      <w:bookmarkStart w:id="237" w:name="_Toc24701"/>
-      <w:bookmarkStart w:id="238" w:name="_Toc13302"/>
-      <w:bookmarkStart w:id="239" w:name="_Toc4994"/>
-      <w:bookmarkStart w:id="240" w:name="_Toc29227"/>
-      <w:bookmarkStart w:id="241" w:name="_Toc3179"/>
+      <w:bookmarkStart w:id="230" w:name="_Toc9868"/>
+      <w:bookmarkStart w:id="231" w:name="_Toc5992"/>
+      <w:bookmarkStart w:id="232" w:name="_Toc16317"/>
+      <w:bookmarkStart w:id="233" w:name="_Toc13302"/>
+      <w:bookmarkStart w:id="234" w:name="_Toc14529"/>
+      <w:bookmarkStart w:id="235" w:name="_Toc1239"/>
+      <w:bookmarkStart w:id="236" w:name="_Toc4994"/>
+      <w:bookmarkStart w:id="237" w:name="_Toc29227"/>
+      <w:bookmarkStart w:id="238" w:name="_Toc3179"/>
+      <w:bookmarkStart w:id="239" w:name="_Toc20883"/>
+      <w:bookmarkStart w:id="240" w:name="_Toc21872"/>
+      <w:bookmarkStart w:id="241" w:name="_Toc24701"/>
       <w:r>
         <w:rPr>
           <w:rFonts w:hint="eastAsia"/>
@@ -13521,18 +13984,18 @@
         <w:pStyle w:val="5"/>
         <w:bidi w:val="0"/>
       </w:pPr>
-      <w:bookmarkStart w:id="242" w:name="_Toc694"/>
-      <w:bookmarkStart w:id="243" w:name="_Toc19419"/>
-      <w:bookmarkStart w:id="244" w:name="_Toc32362"/>
-      <w:bookmarkStart w:id="245" w:name="_Toc27464"/>
-      <w:bookmarkStart w:id="246" w:name="_Toc20734"/>
-      <w:bookmarkStart w:id="247" w:name="_Toc22142"/>
-      <w:bookmarkStart w:id="248" w:name="_Toc230"/>
-      <w:bookmarkStart w:id="249" w:name="_Toc3722"/>
-      <w:bookmarkStart w:id="250" w:name="_Toc10590"/>
-      <w:bookmarkStart w:id="251" w:name="_Toc723"/>
-      <w:bookmarkStart w:id="252" w:name="_Toc17665"/>
-      <w:bookmarkStart w:id="253" w:name="_Toc22532"/>
+      <w:bookmarkStart w:id="242" w:name="_Toc10590"/>
+      <w:bookmarkStart w:id="243" w:name="_Toc723"/>
+      <w:bookmarkStart w:id="244" w:name="_Toc230"/>
+      <w:bookmarkStart w:id="245" w:name="_Toc22142"/>
+      <w:bookmarkStart w:id="246" w:name="_Toc17665"/>
+      <w:bookmarkStart w:id="247" w:name="_Toc3722"/>
+      <w:bookmarkStart w:id="248" w:name="_Toc22532"/>
+      <w:bookmarkStart w:id="249" w:name="_Toc20734"/>
+      <w:bookmarkStart w:id="250" w:name="_Toc694"/>
+      <w:bookmarkStart w:id="251" w:name="_Toc19419"/>
+      <w:bookmarkStart w:id="252" w:name="_Toc32362"/>
+      <w:bookmarkStart w:id="253" w:name="_Toc27464"/>
       <w:r>
         <w:rPr>
           <w:rFonts w:hint="eastAsia"/>
@@ -13749,18 +14212,18 @@
         <w:pStyle w:val="4"/>
         <w:bidi w:val="0"/>
       </w:pPr>
-      <w:bookmarkStart w:id="254" w:name="_Toc16191"/>
-      <w:bookmarkStart w:id="255" w:name="_Toc20803"/>
-      <w:bookmarkStart w:id="256" w:name="_Toc5670"/>
-      <w:bookmarkStart w:id="257" w:name="_Toc236"/>
-      <w:bookmarkStart w:id="258" w:name="_Toc17571"/>
-      <w:bookmarkStart w:id="259" w:name="_Toc3867"/>
-      <w:bookmarkStart w:id="260" w:name="_Toc31345"/>
-      <w:bookmarkStart w:id="261" w:name="_Toc7077623"/>
-      <w:bookmarkStart w:id="262" w:name="_Toc24503"/>
-      <w:bookmarkStart w:id="263" w:name="_Toc16869"/>
-      <w:bookmarkStart w:id="264" w:name="_Toc2863"/>
-      <w:bookmarkStart w:id="265" w:name="_Toc5748"/>
+      <w:bookmarkStart w:id="254" w:name="_Toc7077623"/>
+      <w:bookmarkStart w:id="255" w:name="_Toc236"/>
+      <w:bookmarkStart w:id="256" w:name="_Toc17571"/>
+      <w:bookmarkStart w:id="257" w:name="_Toc16191"/>
+      <w:bookmarkStart w:id="258" w:name="_Toc16869"/>
+      <w:bookmarkStart w:id="259" w:name="_Toc5670"/>
+      <w:bookmarkStart w:id="260" w:name="_Toc20803"/>
+      <w:bookmarkStart w:id="261" w:name="_Toc2863"/>
+      <w:bookmarkStart w:id="262" w:name="_Toc5748"/>
+      <w:bookmarkStart w:id="263" w:name="_Toc31345"/>
+      <w:bookmarkStart w:id="264" w:name="_Toc3867"/>
+      <w:bookmarkStart w:id="265" w:name="_Toc24503"/>
       <w:bookmarkStart w:id="266" w:name="_Toc28861"/>
       <w:r>
         <w:rPr>
@@ -13888,19 +14351,19 @@
         <w:pStyle w:val="4"/>
         <w:bidi w:val="0"/>
       </w:pPr>
-      <w:bookmarkStart w:id="267" w:name="_Toc2536"/>
+      <w:bookmarkStart w:id="267" w:name="_Toc29966"/>
       <w:bookmarkStart w:id="268" w:name="_Toc5562"/>
-      <w:bookmarkStart w:id="269" w:name="_Toc4248"/>
-      <w:bookmarkStart w:id="270" w:name="_Toc5874"/>
-      <w:bookmarkStart w:id="271" w:name="_Toc7077625"/>
-      <w:bookmarkStart w:id="272" w:name="_Toc14130"/>
-      <w:bookmarkStart w:id="273" w:name="_Toc23612"/>
-      <w:bookmarkStart w:id="274" w:name="_Toc21410"/>
-      <w:bookmarkStart w:id="275" w:name="_Toc20844"/>
-      <w:bookmarkStart w:id="276" w:name="_Toc1872"/>
-      <w:bookmarkStart w:id="277" w:name="_Toc23682"/>
-      <w:bookmarkStart w:id="278" w:name="_Toc25395"/>
-      <w:bookmarkStart w:id="279" w:name="_Toc29966"/>
+      <w:bookmarkStart w:id="269" w:name="_Toc2536"/>
+      <w:bookmarkStart w:id="270" w:name="_Toc4248"/>
+      <w:bookmarkStart w:id="271" w:name="_Toc5874"/>
+      <w:bookmarkStart w:id="272" w:name="_Toc7077625"/>
+      <w:bookmarkStart w:id="273" w:name="_Toc14130"/>
+      <w:bookmarkStart w:id="274" w:name="_Toc1872"/>
+      <w:bookmarkStart w:id="275" w:name="_Toc23682"/>
+      <w:bookmarkStart w:id="276" w:name="_Toc23612"/>
+      <w:bookmarkStart w:id="277" w:name="_Toc21410"/>
+      <w:bookmarkStart w:id="278" w:name="_Toc20844"/>
+      <w:bookmarkStart w:id="279" w:name="_Toc25395"/>
       <w:r>
         <w:rPr>
           <w:rFonts w:hint="eastAsia"/>
@@ -13982,19 +14445,19 @@
           <w:lang w:val="en-US" w:eastAsia="zh-CN"/>
         </w:rPr>
       </w:pPr>
-      <w:bookmarkStart w:id="281" w:name="_Toc27714"/>
-      <w:bookmarkStart w:id="282" w:name="_Toc4568"/>
-      <w:bookmarkStart w:id="283" w:name="_Toc4161"/>
-      <w:bookmarkStart w:id="284" w:name="_Toc5650"/>
-      <w:bookmarkStart w:id="285" w:name="_Toc24089"/>
-      <w:bookmarkStart w:id="286" w:name="_Toc7077627"/>
-      <w:bookmarkStart w:id="287" w:name="_Toc1890"/>
-      <w:bookmarkStart w:id="288" w:name="_Toc10630"/>
-      <w:bookmarkStart w:id="289" w:name="_Toc10730"/>
-      <w:bookmarkStart w:id="290" w:name="_Toc13765"/>
-      <w:bookmarkStart w:id="291" w:name="_Toc12596"/>
-      <w:bookmarkStart w:id="292" w:name="_Toc9427"/>
-      <w:bookmarkStart w:id="293" w:name="_Toc24780"/>
+      <w:bookmarkStart w:id="281" w:name="_Toc1890"/>
+      <w:bookmarkStart w:id="282" w:name="_Toc9427"/>
+      <w:bookmarkStart w:id="283" w:name="_Toc10630"/>
+      <w:bookmarkStart w:id="284" w:name="_Toc4161"/>
+      <w:bookmarkStart w:id="285" w:name="_Toc13765"/>
+      <w:bookmarkStart w:id="286" w:name="_Toc24780"/>
+      <w:bookmarkStart w:id="287" w:name="_Toc24089"/>
+      <w:bookmarkStart w:id="288" w:name="_Toc7077627"/>
+      <w:bookmarkStart w:id="289" w:name="_Toc4568"/>
+      <w:bookmarkStart w:id="290" w:name="_Toc27714"/>
+      <w:bookmarkStart w:id="291" w:name="_Toc5650"/>
+      <w:bookmarkStart w:id="292" w:name="_Toc10730"/>
+      <w:bookmarkStart w:id="293" w:name="_Toc12596"/>
       <w:r>
         <w:rPr>
           <w:rFonts w:hint="eastAsia"/>
@@ -14045,18 +14508,18 @@
           <w:lang w:val="en-US" w:eastAsia="zh-CN"/>
         </w:rPr>
       </w:pPr>
-      <w:bookmarkStart w:id="294" w:name="_Toc25934"/>
-      <w:bookmarkStart w:id="295" w:name="_Toc22168"/>
-      <w:bookmarkStart w:id="296" w:name="_Toc30339"/>
-      <w:bookmarkStart w:id="297" w:name="_Toc15662"/>
-      <w:bookmarkStart w:id="298" w:name="_Toc31020"/>
-      <w:bookmarkStart w:id="299" w:name="_Toc28550"/>
-      <w:bookmarkStart w:id="300" w:name="_Toc17901"/>
-      <w:bookmarkStart w:id="301" w:name="_Toc3817"/>
-      <w:bookmarkStart w:id="302" w:name="_Toc32077"/>
-      <w:bookmarkStart w:id="303" w:name="_Toc7077628"/>
+      <w:bookmarkStart w:id="294" w:name="_Toc30339"/>
+      <w:bookmarkStart w:id="295" w:name="_Toc15662"/>
+      <w:bookmarkStart w:id="296" w:name="_Toc31020"/>
+      <w:bookmarkStart w:id="297" w:name="_Toc32077"/>
+      <w:bookmarkStart w:id="298" w:name="_Toc28550"/>
+      <w:bookmarkStart w:id="299" w:name="_Toc25934"/>
+      <w:bookmarkStart w:id="300" w:name="_Toc22168"/>
+      <w:bookmarkStart w:id="301" w:name="_Toc7077628"/>
+      <w:bookmarkStart w:id="302" w:name="_Toc15434"/>
+      <w:bookmarkStart w:id="303" w:name="_Toc3817"/>
       <w:bookmarkStart w:id="304" w:name="_Toc25311"/>
-      <w:bookmarkStart w:id="305" w:name="_Toc15434"/>
+      <w:bookmarkStart w:id="305" w:name="_Toc17901"/>
       <w:bookmarkStart w:id="306" w:name="_Toc14770"/>
       <w:r>
         <w:rPr>
@@ -14181,16 +14644,16 @@
           <w:lang w:val="en-US" w:eastAsia="zh-CN"/>
         </w:rPr>
       </w:pPr>
-      <w:bookmarkStart w:id="308" w:name="_Toc11201"/>
-      <w:bookmarkStart w:id="309" w:name="_Toc13211"/>
-      <w:bookmarkStart w:id="310" w:name="_Toc27028"/>
-      <w:bookmarkStart w:id="311" w:name="_Toc5188"/>
-      <w:bookmarkStart w:id="312" w:name="_Toc31927"/>
-      <w:bookmarkStart w:id="313" w:name="_Toc16230"/>
+      <w:bookmarkStart w:id="308" w:name="_Toc27028"/>
+      <w:bookmarkStart w:id="309" w:name="_Toc31927"/>
+      <w:bookmarkStart w:id="310" w:name="_Toc16230"/>
+      <w:bookmarkStart w:id="311" w:name="_Toc5683"/>
+      <w:bookmarkStart w:id="312" w:name="_Toc13211"/>
+      <w:bookmarkStart w:id="313" w:name="_Toc5188"/>
       <w:bookmarkStart w:id="314" w:name="_Toc22637"/>
-      <w:bookmarkStart w:id="315" w:name="_Toc17911"/>
-      <w:bookmarkStart w:id="316" w:name="_Toc13527"/>
-      <w:bookmarkStart w:id="317" w:name="_Toc5683"/>
+      <w:bookmarkStart w:id="315" w:name="_Toc11201"/>
+      <w:bookmarkStart w:id="316" w:name="_Toc17911"/>
+      <w:bookmarkStart w:id="317" w:name="_Toc13527"/>
       <w:bookmarkStart w:id="318" w:name="_Toc27529"/>
       <w:bookmarkStart w:id="319" w:name="_Toc19469"/>
       <w:r>
@@ -14674,18 +15137,18 @@
         </w:rPr>
       </w:pPr>
       <w:bookmarkStart w:id="320" w:name="_Toc7077632"/>
-      <w:bookmarkStart w:id="321" w:name="_Toc12296"/>
-      <w:bookmarkStart w:id="322" w:name="_Toc2667"/>
-      <w:bookmarkStart w:id="323" w:name="_Toc18308"/>
-      <w:bookmarkStart w:id="324" w:name="_Toc13230"/>
-      <w:bookmarkStart w:id="325" w:name="_Toc2096"/>
-      <w:bookmarkStart w:id="326" w:name="_Toc28933"/>
-      <w:bookmarkStart w:id="327" w:name="_Toc27216"/>
-      <w:bookmarkStart w:id="328" w:name="_Toc19277"/>
-      <w:bookmarkStart w:id="329" w:name="_Toc26182"/>
-      <w:bookmarkStart w:id="330" w:name="_Toc9463"/>
-      <w:bookmarkStart w:id="331" w:name="_Toc5233"/>
-      <w:bookmarkStart w:id="332" w:name="_Toc21623"/>
+      <w:bookmarkStart w:id="321" w:name="_Toc13230"/>
+      <w:bookmarkStart w:id="322" w:name="_Toc2096"/>
+      <w:bookmarkStart w:id="323" w:name="_Toc28933"/>
+      <w:bookmarkStart w:id="324" w:name="_Toc19277"/>
+      <w:bookmarkStart w:id="325" w:name="_Toc27216"/>
+      <w:bookmarkStart w:id="326" w:name="_Toc2667"/>
+      <w:bookmarkStart w:id="327" w:name="_Toc9463"/>
+      <w:bookmarkStart w:id="328" w:name="_Toc18308"/>
+      <w:bookmarkStart w:id="329" w:name="_Toc12296"/>
+      <w:bookmarkStart w:id="330" w:name="_Toc26182"/>
+      <w:bookmarkStart w:id="331" w:name="_Toc21623"/>
+      <w:bookmarkStart w:id="332" w:name="_Toc5233"/>
       <w:r>
         <w:rPr>
           <w:rFonts w:hint="eastAsia"/>
@@ -14841,19 +15304,19 @@
         <w:pStyle w:val="4"/>
         <w:bidi w:val="0"/>
       </w:pPr>
-      <w:bookmarkStart w:id="334" w:name="_Toc12080"/>
-      <w:bookmarkStart w:id="335" w:name="_Toc2638"/>
-      <w:bookmarkStart w:id="336" w:name="_Toc23419"/>
-      <w:bookmarkStart w:id="337" w:name="_Toc15322"/>
-      <w:bookmarkStart w:id="338" w:name="_Toc11120"/>
-      <w:bookmarkStart w:id="339" w:name="_Toc12235"/>
-      <w:bookmarkStart w:id="340" w:name="_Toc7077634"/>
-      <w:bookmarkStart w:id="341" w:name="_Toc11795"/>
-      <w:bookmarkStart w:id="342" w:name="_Toc19985"/>
-      <w:bookmarkStart w:id="343" w:name="_Toc2479"/>
+      <w:bookmarkStart w:id="334" w:name="_Toc1829"/>
+      <w:bookmarkStart w:id="335" w:name="_Toc12235"/>
+      <w:bookmarkStart w:id="336" w:name="_Toc19985"/>
+      <w:bookmarkStart w:id="337" w:name="_Toc2479"/>
+      <w:bookmarkStart w:id="338" w:name="_Toc12080"/>
+      <w:bookmarkStart w:id="339" w:name="_Toc11795"/>
+      <w:bookmarkStart w:id="340" w:name="_Toc2638"/>
+      <w:bookmarkStart w:id="341" w:name="_Toc15322"/>
+      <w:bookmarkStart w:id="342" w:name="_Toc23419"/>
+      <w:bookmarkStart w:id="343" w:name="_Toc7077634"/>
       <w:bookmarkStart w:id="344" w:name="_Toc5438"/>
-      <w:bookmarkStart w:id="345" w:name="_Toc32210"/>
-      <w:bookmarkStart w:id="346" w:name="_Toc1829"/>
+      <w:bookmarkStart w:id="345" w:name="_Toc11120"/>
+      <w:bookmarkStart w:id="346" w:name="_Toc32210"/>
       <w:r>
         <w:rPr>
           <w:rFonts w:hint="eastAsia"/>
@@ -15001,19 +15464,19 @@
         <w:pStyle w:val="4"/>
         <w:bidi w:val="0"/>
       </w:pPr>
-      <w:bookmarkStart w:id="347" w:name="_Toc8675"/>
-      <w:bookmarkStart w:id="348" w:name="_Toc11265"/>
-      <w:bookmarkStart w:id="349" w:name="_Toc1639"/>
-      <w:bookmarkStart w:id="350" w:name="_Toc617"/>
-      <w:bookmarkStart w:id="351" w:name="_Toc22403"/>
-      <w:bookmarkStart w:id="352" w:name="_Toc29224"/>
-      <w:bookmarkStart w:id="353" w:name="_Toc28946"/>
-      <w:bookmarkStart w:id="354" w:name="_Toc13791"/>
-      <w:bookmarkStart w:id="355" w:name="_Toc5117"/>
-      <w:bookmarkStart w:id="356" w:name="_Toc22241"/>
-      <w:bookmarkStart w:id="357" w:name="_Toc16767"/>
-      <w:bookmarkStart w:id="358" w:name="_Toc7077636"/>
-      <w:bookmarkStart w:id="359" w:name="_Toc8512"/>
+      <w:bookmarkStart w:id="347" w:name="_Toc8512"/>
+      <w:bookmarkStart w:id="348" w:name="_Toc29224"/>
+      <w:bookmarkStart w:id="349" w:name="_Toc22241"/>
+      <w:bookmarkStart w:id="350" w:name="_Toc5117"/>
+      <w:bookmarkStart w:id="351" w:name="_Toc1639"/>
+      <w:bookmarkStart w:id="352" w:name="_Toc13791"/>
+      <w:bookmarkStart w:id="353" w:name="_Toc22403"/>
+      <w:bookmarkStart w:id="354" w:name="_Toc11265"/>
+      <w:bookmarkStart w:id="355" w:name="_Toc16767"/>
+      <w:bookmarkStart w:id="356" w:name="_Toc28946"/>
+      <w:bookmarkStart w:id="357" w:name="_Toc7077636"/>
+      <w:bookmarkStart w:id="358" w:name="_Toc617"/>
+      <w:bookmarkStart w:id="359" w:name="_Toc8675"/>
       <w:r>
         <w:rPr>
           <w:rFonts w:hint="eastAsia"/>
@@ -15090,15 +15553,15 @@
           <w:szCs w:val="44"/>
         </w:rPr>
       </w:pPr>
-      <w:bookmarkStart w:id="361" w:name="_Toc14846"/>
-      <w:bookmarkStart w:id="362" w:name="_Toc2873"/>
-      <w:bookmarkStart w:id="363" w:name="_Toc7800"/>
-      <w:bookmarkStart w:id="364" w:name="_Toc5701"/>
-      <w:bookmarkStart w:id="365" w:name="_Toc2166"/>
-      <w:bookmarkStart w:id="366" w:name="_Toc11786"/>
-      <w:bookmarkStart w:id="367" w:name="_Toc22225"/>
-      <w:bookmarkStart w:id="368" w:name="_Toc5725"/>
-      <w:bookmarkStart w:id="369" w:name="_Toc291"/>
+      <w:bookmarkStart w:id="361" w:name="_Toc7800"/>
+      <w:bookmarkStart w:id="362" w:name="_Toc2166"/>
+      <w:bookmarkStart w:id="363" w:name="_Toc22225"/>
+      <w:bookmarkStart w:id="364" w:name="_Toc5725"/>
+      <w:bookmarkStart w:id="365" w:name="_Toc14846"/>
+      <w:bookmarkStart w:id="366" w:name="_Toc291"/>
+      <w:bookmarkStart w:id="367" w:name="_Toc5701"/>
+      <w:bookmarkStart w:id="368" w:name="_Toc2873"/>
+      <w:bookmarkStart w:id="369" w:name="_Toc11786"/>
       <w:bookmarkStart w:id="370" w:name="_Toc973"/>
       <w:bookmarkStart w:id="371" w:name="_Toc12520"/>
       <w:bookmarkStart w:id="372" w:name="_Toc19298"/>
@@ -15162,17 +15625,17 @@
         </w:rPr>
       </w:pPr>
       <w:bookmarkStart w:id="375" w:name="_Toc4464"/>
-      <w:bookmarkStart w:id="376" w:name="_Toc23199"/>
+      <w:bookmarkStart w:id="376" w:name="_Toc6721"/>
       <w:bookmarkStart w:id="377" w:name="_Toc29140"/>
-      <w:bookmarkStart w:id="378" w:name="_Toc19452"/>
-      <w:bookmarkStart w:id="379" w:name="_Toc1006"/>
-      <w:bookmarkStart w:id="380" w:name="_Toc10479"/>
-      <w:bookmarkStart w:id="381" w:name="_Toc6721"/>
-      <w:bookmarkStart w:id="382" w:name="_Toc9290"/>
-      <w:bookmarkStart w:id="383" w:name="_Toc1338"/>
-      <w:bookmarkStart w:id="384" w:name="_Toc796"/>
-      <w:bookmarkStart w:id="385" w:name="_Toc11516"/>
-      <w:bookmarkStart w:id="386" w:name="_Toc24438"/>
+      <w:bookmarkStart w:id="378" w:name="_Toc24438"/>
+      <w:bookmarkStart w:id="379" w:name="_Toc1338"/>
+      <w:bookmarkStart w:id="380" w:name="_Toc23199"/>
+      <w:bookmarkStart w:id="381" w:name="_Toc796"/>
+      <w:bookmarkStart w:id="382" w:name="_Toc10479"/>
+      <w:bookmarkStart w:id="383" w:name="_Toc11516"/>
+      <w:bookmarkStart w:id="384" w:name="_Toc9290"/>
+      <w:bookmarkStart w:id="385" w:name="_Toc1006"/>
+      <w:bookmarkStart w:id="386" w:name="_Toc19452"/>
       <w:r>
         <w:rPr>
           <w:rFonts w:hint="eastAsia"/>
@@ -15276,7 +15739,7 @@
                     </pic:cNvPicPr>
                   </pic:nvPicPr>
                   <pic:blipFill>
-                    <a:blip r:embed="rId78"/>
+                    <a:blip r:embed="rId80"/>
                     <a:stretch>
                       <a:fillRect/>
                     </a:stretch>
@@ -15340,7 +15803,7 @@
                     </pic:cNvPicPr>
                   </pic:nvPicPr>
                   <pic:blipFill>
-                    <a:blip r:embed="rId79"/>
+                    <a:blip r:embed="rId81"/>
                     <a:stretch>
                       <a:fillRect/>
                     </a:stretch>
@@ -15459,7 +15922,7 @@
                     </pic:cNvPicPr>
                   </pic:nvPicPr>
                   <pic:blipFill>
-                    <a:blip r:embed="rId80"/>
+                    <a:blip r:embed="rId82"/>
                     <a:stretch>
                       <a:fillRect/>
                     </a:stretch>
@@ -15560,18 +16023,18 @@
           <w:lang w:val="en-US" w:eastAsia="zh-CN"/>
         </w:rPr>
       </w:pPr>
-      <w:bookmarkStart w:id="387" w:name="_Toc30466"/>
-      <w:bookmarkStart w:id="388" w:name="_Toc17647"/>
-      <w:bookmarkStart w:id="389" w:name="_Toc28126"/>
-      <w:bookmarkStart w:id="390" w:name="_Toc24625"/>
-      <w:bookmarkStart w:id="391" w:name="_Toc4468"/>
-      <w:bookmarkStart w:id="392" w:name="_Toc21057"/>
-      <w:bookmarkStart w:id="393" w:name="_Toc7441"/>
-      <w:bookmarkStart w:id="394" w:name="_Toc21440"/>
-      <w:bookmarkStart w:id="395" w:name="_Toc22284"/>
-      <w:bookmarkStart w:id="396" w:name="_Toc17758"/>
-      <w:bookmarkStart w:id="397" w:name="_Toc18857"/>
-      <w:bookmarkStart w:id="398" w:name="_Toc12428"/>
+      <w:bookmarkStart w:id="387" w:name="_Toc12428"/>
+      <w:bookmarkStart w:id="388" w:name="_Toc24625"/>
+      <w:bookmarkStart w:id="389" w:name="_Toc18857"/>
+      <w:bookmarkStart w:id="390" w:name="_Toc30466"/>
+      <w:bookmarkStart w:id="391" w:name="_Toc28126"/>
+      <w:bookmarkStart w:id="392" w:name="_Toc17758"/>
+      <w:bookmarkStart w:id="393" w:name="_Toc22284"/>
+      <w:bookmarkStart w:id="394" w:name="_Toc7441"/>
+      <w:bookmarkStart w:id="395" w:name="_Toc21440"/>
+      <w:bookmarkStart w:id="396" w:name="_Toc21057"/>
+      <w:bookmarkStart w:id="397" w:name="_Toc4468"/>
+      <w:bookmarkStart w:id="398" w:name="_Toc17647"/>
       <w:r>
         <w:rPr>
           <w:rFonts w:hint="eastAsia"/>
@@ -15839,7 +16302,7 @@
                     </pic:cNvPicPr>
                   </pic:nvPicPr>
                   <pic:blipFill>
-                    <a:blip r:embed="rId81"/>
+                    <a:blip r:embed="rId83"/>
                     <a:stretch>
                       <a:fillRect/>
                     </a:stretch>
@@ -16008,7 +16471,7 @@
                     </pic:cNvPicPr>
                   </pic:nvPicPr>
                   <pic:blipFill>
-                    <a:blip r:embed="rId82"/>
+                    <a:blip r:embed="rId84"/>
                     <a:stretch>
                       <a:fillRect/>
                     </a:stretch>
@@ -16060,7 +16523,7 @@
                     </pic:cNvPicPr>
                   </pic:nvPicPr>
                   <pic:blipFill>
-                    <a:blip r:embed="rId83"/>
+                    <a:blip r:embed="rId85"/>
                     <a:stretch>
                       <a:fillRect/>
                     </a:stretch>
@@ -16115,7 +16578,7 @@
                     </pic:cNvPicPr>
                   </pic:nvPicPr>
                   <pic:blipFill>
-                    <a:blip r:embed="rId84"/>
+                    <a:blip r:embed="rId86"/>
                     <a:stretch>
                       <a:fillRect/>
                     </a:stretch>
@@ -16170,7 +16633,7 @@
                     </pic:cNvPicPr>
                   </pic:nvPicPr>
                   <pic:blipFill>
-                    <a:blip r:embed="rId85"/>
+                    <a:blip r:embed="rId87"/>
                     <a:stretch>
                       <a:fillRect/>
                     </a:stretch>
@@ -16208,14 +16671,14 @@
       </w:pPr>
       <w:bookmarkStart w:id="399" w:name="_Toc19124"/>
       <w:bookmarkStart w:id="400" w:name="_Toc12693"/>
-      <w:bookmarkStart w:id="401" w:name="_Toc14871"/>
-      <w:bookmarkStart w:id="402" w:name="_Toc3835"/>
-      <w:bookmarkStart w:id="403" w:name="_Toc5230"/>
-      <w:bookmarkStart w:id="404" w:name="_Toc739"/>
-      <w:bookmarkStart w:id="405" w:name="_Toc16152"/>
-      <w:bookmarkStart w:id="406" w:name="_Toc32437"/>
-      <w:bookmarkStart w:id="407" w:name="_Toc17603"/>
-      <w:bookmarkStart w:id="408" w:name="_Toc18325"/>
+      <w:bookmarkStart w:id="401" w:name="_Toc739"/>
+      <w:bookmarkStart w:id="402" w:name="_Toc18325"/>
+      <w:bookmarkStart w:id="403" w:name="_Toc14871"/>
+      <w:bookmarkStart w:id="404" w:name="_Toc3835"/>
+      <w:bookmarkStart w:id="405" w:name="_Toc32437"/>
+      <w:bookmarkStart w:id="406" w:name="_Toc17603"/>
+      <w:bookmarkStart w:id="407" w:name="_Toc5230"/>
+      <w:bookmarkStart w:id="408" w:name="_Toc16152"/>
       <w:bookmarkStart w:id="409" w:name="_Toc6680"/>
       <w:bookmarkStart w:id="410" w:name="_Toc10071"/>
       <w:r>
@@ -16237,7 +16700,7 @@
                     </pic:cNvPicPr>
                   </pic:nvPicPr>
                   <pic:blipFill>
-                    <a:blip r:embed="rId86"/>
+                    <a:blip r:embed="rId88"/>
                     <a:stretch>
                       <a:fillRect/>
                     </a:stretch>
@@ -16289,7 +16752,7 @@
                     </pic:cNvPicPr>
                   </pic:nvPicPr>
                   <pic:blipFill>
-                    <a:blip r:embed="rId87"/>
+                    <a:blip r:embed="rId89"/>
                     <a:stretch>
                       <a:fillRect/>
                     </a:stretch>
@@ -16350,17 +16813,17 @@
         <w:t>4.</w:t>
       </w:r>
       <w:bookmarkEnd w:id="373"/>
-      <w:bookmarkStart w:id="411" w:name="_Toc23026"/>
-      <w:bookmarkStart w:id="412" w:name="_Toc8910"/>
-      <w:bookmarkStart w:id="413" w:name="_Toc6796"/>
-      <w:bookmarkStart w:id="414" w:name="_Toc27078"/>
-      <w:bookmarkStart w:id="415" w:name="_Toc16942"/>
-      <w:bookmarkStart w:id="416" w:name="_Toc19925"/>
-      <w:bookmarkStart w:id="417" w:name="_Toc19263"/>
-      <w:bookmarkStart w:id="418" w:name="_Toc5903"/>
-      <w:bookmarkStart w:id="419" w:name="_Toc11585"/>
+      <w:bookmarkStart w:id="411" w:name="_Toc16942"/>
+      <w:bookmarkStart w:id="412" w:name="_Toc19925"/>
+      <w:bookmarkStart w:id="413" w:name="_Toc19263"/>
+      <w:bookmarkStart w:id="414" w:name="_Toc23026"/>
+      <w:bookmarkStart w:id="415" w:name="_Toc6796"/>
+      <w:bookmarkStart w:id="416" w:name="_Toc5903"/>
+      <w:bookmarkStart w:id="417" w:name="_Toc23906"/>
+      <w:bookmarkStart w:id="418" w:name="_Toc11585"/>
+      <w:bookmarkStart w:id="419" w:name="_Toc8910"/>
       <w:bookmarkStart w:id="420" w:name="_Toc15692"/>
-      <w:bookmarkStart w:id="421" w:name="_Toc23906"/>
+      <w:bookmarkStart w:id="421" w:name="_Toc27078"/>
       <w:bookmarkStart w:id="422" w:name="_Toc19273"/>
       <w:r>
         <w:rPr>
@@ -16424,18 +16887,18 @@
         <w:pStyle w:val="5"/>
         <w:bidi w:val="0"/>
       </w:pPr>
-      <w:bookmarkStart w:id="424" w:name="_Toc2671"/>
-      <w:bookmarkStart w:id="425" w:name="_Toc12653"/>
-      <w:bookmarkStart w:id="426" w:name="_Toc12536"/>
-      <w:bookmarkStart w:id="427" w:name="_Toc21875"/>
-      <w:bookmarkStart w:id="428" w:name="_Toc15923"/>
-      <w:bookmarkStart w:id="429" w:name="_Toc3685"/>
-      <w:bookmarkStart w:id="430" w:name="_Toc16206"/>
-      <w:bookmarkStart w:id="431" w:name="_Toc2708"/>
-      <w:bookmarkStart w:id="432" w:name="_Toc31509"/>
-      <w:bookmarkStart w:id="433" w:name="_Toc8468"/>
-      <w:bookmarkStart w:id="434" w:name="_Toc4234"/>
-      <w:bookmarkStart w:id="435" w:name="_Toc1085"/>
+      <w:bookmarkStart w:id="424" w:name="_Toc21875"/>
+      <w:bookmarkStart w:id="425" w:name="_Toc2708"/>
+      <w:bookmarkStart w:id="426" w:name="_Toc12653"/>
+      <w:bookmarkStart w:id="427" w:name="_Toc31509"/>
+      <w:bookmarkStart w:id="428" w:name="_Toc2671"/>
+      <w:bookmarkStart w:id="429" w:name="_Toc16206"/>
+      <w:bookmarkStart w:id="430" w:name="_Toc1085"/>
+      <w:bookmarkStart w:id="431" w:name="_Toc8468"/>
+      <w:bookmarkStart w:id="432" w:name="_Toc4234"/>
+      <w:bookmarkStart w:id="433" w:name="_Toc3685"/>
+      <w:bookmarkStart w:id="434" w:name="_Toc15923"/>
+      <w:bookmarkStart w:id="435" w:name="_Toc12536"/>
       <w:r>
         <w:rPr>
           <w:rFonts w:hint="eastAsia"/>
@@ -16484,18 +16947,18 @@
         </w:rPr>
       </w:pPr>
       <w:bookmarkStart w:id="436" w:name="_Toc7077643"/>
-      <w:bookmarkStart w:id="437" w:name="_Toc21191"/>
-      <w:bookmarkStart w:id="438" w:name="_Toc10792"/>
-      <w:bookmarkStart w:id="439" w:name="_Toc22437"/>
-      <w:bookmarkStart w:id="440" w:name="_Toc22265"/>
-      <w:bookmarkStart w:id="441" w:name="_Toc30951"/>
-      <w:bookmarkStart w:id="442" w:name="_Toc28392"/>
-      <w:bookmarkStart w:id="443" w:name="_Toc4705"/>
-      <w:bookmarkStart w:id="444" w:name="_Toc21885"/>
-      <w:bookmarkStart w:id="445" w:name="_Toc7173"/>
-      <w:bookmarkStart w:id="446" w:name="_Toc24064"/>
-      <w:bookmarkStart w:id="447" w:name="_Toc2816"/>
-      <w:bookmarkStart w:id="448" w:name="_Toc32611"/>
+      <w:bookmarkStart w:id="437" w:name="_Toc22265"/>
+      <w:bookmarkStart w:id="438" w:name="_Toc2816"/>
+      <w:bookmarkStart w:id="439" w:name="_Toc30951"/>
+      <w:bookmarkStart w:id="440" w:name="_Toc22437"/>
+      <w:bookmarkStart w:id="441" w:name="_Toc28392"/>
+      <w:bookmarkStart w:id="442" w:name="_Toc4705"/>
+      <w:bookmarkStart w:id="443" w:name="_Toc21885"/>
+      <w:bookmarkStart w:id="444" w:name="_Toc7173"/>
+      <w:bookmarkStart w:id="445" w:name="_Toc24064"/>
+      <w:bookmarkStart w:id="446" w:name="_Toc32611"/>
+      <w:bookmarkStart w:id="447" w:name="_Toc21191"/>
+      <w:bookmarkStart w:id="448" w:name="_Toc10792"/>
       <w:r>
         <w:rPr>
           <w:rFonts w:hint="eastAsia"/>
@@ -16619,18 +17082,18 @@
           <w:rFonts w:hint="eastAsia"/>
         </w:rPr>
       </w:pPr>
-      <w:bookmarkStart w:id="450" w:name="_Toc31120"/>
-      <w:bookmarkStart w:id="451" w:name="_Toc3442"/>
-      <w:bookmarkStart w:id="452" w:name="_Toc16275"/>
+      <w:bookmarkStart w:id="450" w:name="_Toc3442"/>
+      <w:bookmarkStart w:id="451" w:name="_Toc16275"/>
+      <w:bookmarkStart w:id="452" w:name="_Toc31120"/>
       <w:bookmarkStart w:id="453" w:name="_Toc29453"/>
-      <w:bookmarkStart w:id="454" w:name="_Toc23233"/>
-      <w:bookmarkStart w:id="455" w:name="_Toc9015"/>
-      <w:bookmarkStart w:id="456" w:name="_Toc31324"/>
-      <w:bookmarkStart w:id="457" w:name="_Toc12823"/>
-      <w:bookmarkStart w:id="458" w:name="_Toc12727"/>
-      <w:bookmarkStart w:id="459" w:name="_Toc4855"/>
-      <w:bookmarkStart w:id="460" w:name="_Toc15140"/>
-      <w:bookmarkStart w:id="461" w:name="_Toc25144"/>
+      <w:bookmarkStart w:id="454" w:name="_Toc12727"/>
+      <w:bookmarkStart w:id="455" w:name="_Toc15140"/>
+      <w:bookmarkStart w:id="456" w:name="_Toc23233"/>
+      <w:bookmarkStart w:id="457" w:name="_Toc25144"/>
+      <w:bookmarkStart w:id="458" w:name="_Toc4855"/>
+      <w:bookmarkStart w:id="459" w:name="_Toc9015"/>
+      <w:bookmarkStart w:id="460" w:name="_Toc12823"/>
+      <w:bookmarkStart w:id="461" w:name="_Toc31324"/>
       <w:r>
         <w:rPr>
           <w:rFonts w:hint="eastAsia"/>
@@ -16696,18 +17159,18 @@
           <w:lang w:val="en-US" w:eastAsia="zh-CN"/>
         </w:rPr>
       </w:pPr>
-      <w:bookmarkStart w:id="462" w:name="_Toc9035"/>
-      <w:bookmarkStart w:id="463" w:name="_Toc27883"/>
-      <w:bookmarkStart w:id="464" w:name="_Toc27406"/>
-      <w:bookmarkStart w:id="465" w:name="_Toc25132"/>
-      <w:bookmarkStart w:id="466" w:name="_Toc1887"/>
-      <w:bookmarkStart w:id="467" w:name="_Toc8953"/>
-      <w:bookmarkStart w:id="468" w:name="_Toc13441"/>
-      <w:bookmarkStart w:id="469" w:name="_Toc25082"/>
-      <w:bookmarkStart w:id="470" w:name="_Toc20712"/>
-      <w:bookmarkStart w:id="471" w:name="_Toc7394"/>
-      <w:bookmarkStart w:id="472" w:name="_Toc7411"/>
-      <w:bookmarkStart w:id="473" w:name="_Toc32735"/>
+      <w:bookmarkStart w:id="462" w:name="_Toc32735"/>
+      <w:bookmarkStart w:id="463" w:name="_Toc1887"/>
+      <w:bookmarkStart w:id="464" w:name="_Toc25132"/>
+      <w:bookmarkStart w:id="465" w:name="_Toc7411"/>
+      <w:bookmarkStart w:id="466" w:name="_Toc27883"/>
+      <w:bookmarkStart w:id="467" w:name="_Toc25082"/>
+      <w:bookmarkStart w:id="468" w:name="_Toc7394"/>
+      <w:bookmarkStart w:id="469" w:name="_Toc13441"/>
+      <w:bookmarkStart w:id="470" w:name="_Toc27406"/>
+      <w:bookmarkStart w:id="471" w:name="_Toc8953"/>
+      <w:bookmarkStart w:id="472" w:name="_Toc9035"/>
+      <w:bookmarkStart w:id="473" w:name="_Toc20712"/>
       <w:r>
         <w:rPr>
           <w:rFonts w:hint="eastAsia"/>
@@ -17348,7 +17811,7 @@
                     </pic:cNvPicPr>
                   </pic:nvPicPr>
                   <pic:blipFill>
-                    <a:blip r:embed="rId88"/>
+                    <a:blip r:embed="rId90"/>
                     <a:stretch>
                       <a:fillRect/>
                     </a:stretch>
@@ -17414,12 +17877,7 @@
         <w:ind w:firstLine="516" w:firstLineChars="200"/>
       </w:pPr>
       <w:r>
-        <w:t>本章针对单流ViT架构在行人重识别任务中的模态依赖偏差与特征</w:t>
-      </w:r>
-      <w:bookmarkStart w:id="621" w:name="_GoBack"/>
-      <w:bookmarkEnd w:id="621"/>
-      <w:r>
-        <w:t>耦合干扰问题，提出了一种基于双流ViT可扩展行人重识别方法。通过融合CLIP预训练的文本对齐ViT与自监督EVA ViT，构建异构双流编码架构，并设计因果注意力掩码机制实现动态特征融合，抑制辅助模态对主模态的逆向干扰。实验结果表明，双流ViT在CUHK-PEDES、ICFG-PEDES和RSTPReid数据集上的Rank-1准确率分别达到75.</w:t>
+        <w:t>本章针对单流ViT架构在行人重识别任务中的模态依赖偏差与特征耦合干扰问题，提出了一种基于双流ViT可扩展行人重识别方法。通过融合CLIP预训练的文本对齐ViT与自监督EVA ViT，构建异构双流编码架构，并设计因果注意力掩码机制实现动态特征融合，抑制辅助模态对主模态的逆向干扰。实验结果表明，双流ViT在CUHK-PEDES、ICFG-PEDES和RSTPReid数据集上的Rank-1准确率分别达到75.</w:t>
       </w:r>
       <w:r>
         <w:rPr>
@@ -17478,18 +17936,18 @@
         <w:bidi w:val="0"/>
         <w:jc w:val="center"/>
       </w:pPr>
-      <w:bookmarkStart w:id="474" w:name="_Toc19053"/>
-      <w:bookmarkStart w:id="475" w:name="_Toc23415"/>
-      <w:bookmarkStart w:id="476" w:name="_Toc24046"/>
-      <w:bookmarkStart w:id="477" w:name="_Toc28781"/>
-      <w:bookmarkStart w:id="478" w:name="_Toc29130"/>
-      <w:bookmarkStart w:id="479" w:name="_Toc23265"/>
-      <w:bookmarkStart w:id="480" w:name="_Toc12651"/>
-      <w:bookmarkStart w:id="481" w:name="_Toc22547"/>
-      <w:bookmarkStart w:id="482" w:name="_Toc1684"/>
-      <w:bookmarkStart w:id="483" w:name="_Toc16710"/>
-      <w:bookmarkStart w:id="484" w:name="_Toc29643"/>
-      <w:bookmarkStart w:id="485" w:name="_Toc24297"/>
+      <w:bookmarkStart w:id="474" w:name="_Toc23415"/>
+      <w:bookmarkStart w:id="475" w:name="_Toc23265"/>
+      <w:bookmarkStart w:id="476" w:name="_Toc12651"/>
+      <w:bookmarkStart w:id="477" w:name="_Toc22547"/>
+      <w:bookmarkStart w:id="478" w:name="_Toc19053"/>
+      <w:bookmarkStart w:id="479" w:name="_Toc28781"/>
+      <w:bookmarkStart w:id="480" w:name="_Toc29130"/>
+      <w:bookmarkStart w:id="481" w:name="_Toc16710"/>
+      <w:bookmarkStart w:id="482" w:name="_Toc24297"/>
+      <w:bookmarkStart w:id="483" w:name="_Toc1684"/>
+      <w:bookmarkStart w:id="484" w:name="_Toc24046"/>
+      <w:bookmarkStart w:id="485" w:name="_Toc29643"/>
       <w:r>
         <w:rPr>
           <w:rFonts w:hint="eastAsia"/>
@@ -17525,18 +17983,18 @@
           <w:lang w:val="en-US" w:eastAsia="zh-CN"/>
         </w:rPr>
       </w:pPr>
-      <w:bookmarkStart w:id="486" w:name="_Toc13902"/>
-      <w:bookmarkStart w:id="487" w:name="_Toc8754"/>
-      <w:bookmarkStart w:id="488" w:name="_Toc24348"/>
-      <w:bookmarkStart w:id="489" w:name="_Toc2560"/>
-      <w:bookmarkStart w:id="490" w:name="_Toc28969"/>
-      <w:bookmarkStart w:id="491" w:name="_Toc20203"/>
-      <w:bookmarkStart w:id="492" w:name="_Toc2311"/>
-      <w:bookmarkStart w:id="493" w:name="_Toc2397"/>
-      <w:bookmarkStart w:id="494" w:name="_Toc532"/>
-      <w:bookmarkStart w:id="495" w:name="_Toc20321"/>
-      <w:bookmarkStart w:id="496" w:name="_Toc27462"/>
-      <w:bookmarkStart w:id="497" w:name="_Toc17026"/>
+      <w:bookmarkStart w:id="486" w:name="_Toc20203"/>
+      <w:bookmarkStart w:id="487" w:name="_Toc27462"/>
+      <w:bookmarkStart w:id="488" w:name="_Toc20321"/>
+      <w:bookmarkStart w:id="489" w:name="_Toc17026"/>
+      <w:bookmarkStart w:id="490" w:name="_Toc8754"/>
+      <w:bookmarkStart w:id="491" w:name="_Toc532"/>
+      <w:bookmarkStart w:id="492" w:name="_Toc2397"/>
+      <w:bookmarkStart w:id="493" w:name="_Toc2560"/>
+      <w:bookmarkStart w:id="494" w:name="_Toc13902"/>
+      <w:bookmarkStart w:id="495" w:name="_Toc28969"/>
+      <w:bookmarkStart w:id="496" w:name="_Toc24348"/>
+      <w:bookmarkStart w:id="497" w:name="_Toc2311"/>
       <w:r>
         <w:rPr>
           <w:rFonts w:hint="eastAsia"/>
@@ -17620,10 +18078,10 @@
           <w:lang w:val="en-US" w:eastAsia="zh-CN"/>
         </w:rPr>
       </w:pPr>
-      <w:bookmarkStart w:id="498" w:name="_Toc2566"/>
+      <w:bookmarkStart w:id="498" w:name="_Toc14091"/>
       <w:bookmarkStart w:id="499" w:name="_Toc4718"/>
-      <w:bookmarkStart w:id="500" w:name="_Toc14091"/>
-      <w:bookmarkStart w:id="501" w:name="_Toc22445"/>
+      <w:bookmarkStart w:id="500" w:name="_Toc22445"/>
+      <w:bookmarkStart w:id="501" w:name="_Toc2566"/>
       <w:bookmarkStart w:id="502" w:name="_Toc15446"/>
       <w:bookmarkStart w:id="503" w:name="_Toc29112"/>
       <w:bookmarkStart w:id="504" w:name="_Toc24158"/>
@@ -17852,15 +18310,15 @@
           <w:szCs w:val="22"/>
         </w:rPr>
       </w:pPr>
-      <w:bookmarkStart w:id="510" w:name="_Toc18355"/>
-      <w:bookmarkStart w:id="511" w:name="_Toc30589"/>
-      <w:bookmarkStart w:id="512" w:name="_Toc14785"/>
-      <w:bookmarkStart w:id="513" w:name="_Toc3233"/>
-      <w:bookmarkStart w:id="514" w:name="_Toc11246"/>
-      <w:bookmarkStart w:id="515" w:name="_Toc44"/>
-      <w:bookmarkStart w:id="516" w:name="_Toc18982"/>
-      <w:bookmarkStart w:id="517" w:name="_Toc25937"/>
-      <w:bookmarkStart w:id="518" w:name="_Toc4940"/>
+      <w:bookmarkStart w:id="510" w:name="_Toc14785"/>
+      <w:bookmarkStart w:id="511" w:name="_Toc18355"/>
+      <w:bookmarkStart w:id="512" w:name="_Toc30589"/>
+      <w:bookmarkStart w:id="513" w:name="_Toc44"/>
+      <w:bookmarkStart w:id="514" w:name="_Toc4940"/>
+      <w:bookmarkStart w:id="515" w:name="_Toc25937"/>
+      <w:bookmarkStart w:id="516" w:name="_Toc3233"/>
+      <w:bookmarkStart w:id="517" w:name="_Toc11246"/>
+      <w:bookmarkStart w:id="518" w:name="_Toc18982"/>
       <w:r>
         <w:rPr>
           <w:rFonts w:hint="eastAsia"/>
@@ -17910,14 +18368,14 @@
           <w:lang w:val="en-US" w:eastAsia="zh-CN"/>
         </w:rPr>
       </w:pPr>
-      <w:bookmarkStart w:id="519" w:name="_Toc5009"/>
-      <w:bookmarkStart w:id="520" w:name="_Toc3418"/>
-      <w:bookmarkStart w:id="521" w:name="_Toc6675"/>
-      <w:bookmarkStart w:id="522" w:name="_Toc30972"/>
-      <w:bookmarkStart w:id="523" w:name="_Toc10855"/>
-      <w:bookmarkStart w:id="524" w:name="_Toc9640"/>
+      <w:bookmarkStart w:id="519" w:name="_Toc10855"/>
+      <w:bookmarkStart w:id="520" w:name="_Toc6675"/>
+      <w:bookmarkStart w:id="521" w:name="_Toc3418"/>
+      <w:bookmarkStart w:id="522" w:name="_Toc9640"/>
+      <w:bookmarkStart w:id="523" w:name="_Toc11649"/>
+      <w:bookmarkStart w:id="524" w:name="_Toc30972"/>
       <w:bookmarkStart w:id="525" w:name="_Toc5902"/>
-      <w:bookmarkStart w:id="526" w:name="_Toc11649"/>
+      <w:bookmarkStart w:id="526" w:name="_Toc5009"/>
       <w:bookmarkStart w:id="527" w:name="_Toc8305"/>
       <w:r>
         <w:rPr>
@@ -18131,18 +18589,18 @@
           <w:lang w:val="en-US"/>
         </w:rPr>
       </w:pPr>
-      <w:bookmarkStart w:id="528" w:name="_Toc29507"/>
-      <w:bookmarkStart w:id="529" w:name="_Toc3189"/>
-      <w:bookmarkStart w:id="530" w:name="_Toc16690"/>
-      <w:bookmarkStart w:id="531" w:name="_Toc4284"/>
-      <w:bookmarkStart w:id="532" w:name="_Toc23575"/>
-      <w:bookmarkStart w:id="533" w:name="_Toc3490"/>
-      <w:bookmarkStart w:id="534" w:name="_Toc20438"/>
-      <w:bookmarkStart w:id="535" w:name="_Toc31848"/>
-      <w:bookmarkStart w:id="536" w:name="_Toc16793"/>
+      <w:bookmarkStart w:id="528" w:name="_Toc16690"/>
+      <w:bookmarkStart w:id="529" w:name="_Toc3490"/>
+      <w:bookmarkStart w:id="530" w:name="_Toc3189"/>
+      <w:bookmarkStart w:id="531" w:name="_Toc23575"/>
+      <w:bookmarkStart w:id="532" w:name="_Toc16793"/>
+      <w:bookmarkStart w:id="533" w:name="_Toc4284"/>
+      <w:bookmarkStart w:id="534" w:name="_Toc29507"/>
+      <w:bookmarkStart w:id="535" w:name="_Toc20438"/>
+      <w:bookmarkStart w:id="536" w:name="_Toc31848"/>
       <w:bookmarkStart w:id="537" w:name="_Toc11597"/>
-      <w:bookmarkStart w:id="538" w:name="_Toc30827"/>
-      <w:bookmarkStart w:id="539" w:name="_Toc5446"/>
+      <w:bookmarkStart w:id="538" w:name="_Toc5446"/>
+      <w:bookmarkStart w:id="539" w:name="_Toc30827"/>
       <w:r>
         <w:rPr>
           <w:rFonts w:hint="eastAsia"/>
@@ -18182,15 +18640,15 @@
           <w:lang w:val="en-US" w:eastAsia="zh-CN"/>
         </w:rPr>
       </w:pPr>
-      <w:bookmarkStart w:id="540" w:name="_Toc18983"/>
-      <w:bookmarkStart w:id="541" w:name="_Toc20800"/>
-      <w:bookmarkStart w:id="542" w:name="_Toc4054"/>
-      <w:bookmarkStart w:id="543" w:name="_Toc17162"/>
-      <w:bookmarkStart w:id="544" w:name="_Toc30563"/>
-      <w:bookmarkStart w:id="545" w:name="_Toc10263"/>
-      <w:bookmarkStart w:id="546" w:name="_Toc3359"/>
-      <w:bookmarkStart w:id="547" w:name="_Toc22737"/>
-      <w:bookmarkStart w:id="548" w:name="_Toc31970"/>
+      <w:bookmarkStart w:id="540" w:name="_Toc17162"/>
+      <w:bookmarkStart w:id="541" w:name="_Toc3359"/>
+      <w:bookmarkStart w:id="542" w:name="_Toc20800"/>
+      <w:bookmarkStart w:id="543" w:name="_Toc10263"/>
+      <w:bookmarkStart w:id="544" w:name="_Toc31970"/>
+      <w:bookmarkStart w:id="545" w:name="_Toc18983"/>
+      <w:bookmarkStart w:id="546" w:name="_Toc4054"/>
+      <w:bookmarkStart w:id="547" w:name="_Toc30563"/>
+      <w:bookmarkStart w:id="548" w:name="_Toc22737"/>
       <w:r>
         <w:rPr>
           <w:rFonts w:hint="eastAsia"/>
@@ -18296,15 +18754,15 @@
           <w:lang w:val="en-US" w:eastAsia="zh-CN"/>
         </w:rPr>
       </w:pPr>
-      <w:bookmarkStart w:id="549" w:name="_Toc15058"/>
-      <w:bookmarkStart w:id="550" w:name="_Toc30788"/>
-      <w:bookmarkStart w:id="551" w:name="_Toc12196"/>
-      <w:bookmarkStart w:id="552" w:name="_Toc19484"/>
-      <w:bookmarkStart w:id="553" w:name="_Toc9986"/>
-      <w:bookmarkStart w:id="554" w:name="_Toc3468"/>
-      <w:bookmarkStart w:id="555" w:name="_Toc26978"/>
-      <w:bookmarkStart w:id="556" w:name="_Toc1451"/>
-      <w:bookmarkStart w:id="557" w:name="_Toc3061"/>
+      <w:bookmarkStart w:id="549" w:name="_Toc12196"/>
+      <w:bookmarkStart w:id="550" w:name="_Toc1451"/>
+      <w:bookmarkStart w:id="551" w:name="_Toc15058"/>
+      <w:bookmarkStart w:id="552" w:name="_Toc30788"/>
+      <w:bookmarkStart w:id="553" w:name="_Toc3468"/>
+      <w:bookmarkStart w:id="554" w:name="_Toc26978"/>
+      <w:bookmarkStart w:id="555" w:name="_Toc3061"/>
+      <w:bookmarkStart w:id="556" w:name="_Toc19484"/>
+      <w:bookmarkStart w:id="557" w:name="_Toc9986"/>
       <w:r>
         <w:rPr>
           <w:rFonts w:hint="eastAsia"/>
@@ -18489,15 +18947,15 @@
         <w:pStyle w:val="4"/>
         <w:bidi w:val="0"/>
       </w:pPr>
-      <w:bookmarkStart w:id="558" w:name="_Toc11534"/>
-      <w:bookmarkStart w:id="559" w:name="_Toc29050"/>
-      <w:bookmarkStart w:id="560" w:name="_Toc9273"/>
-      <w:bookmarkStart w:id="561" w:name="_Toc4618"/>
+      <w:bookmarkStart w:id="558" w:name="_Toc9273"/>
+      <w:bookmarkStart w:id="559" w:name="_Toc7527"/>
+      <w:bookmarkStart w:id="560" w:name="_Toc25336"/>
+      <w:bookmarkStart w:id="561" w:name="_Toc11534"/>
       <w:bookmarkStart w:id="562" w:name="_Toc27846"/>
-      <w:bookmarkStart w:id="563" w:name="_Toc25336"/>
-      <w:bookmarkStart w:id="564" w:name="_Toc4658"/>
-      <w:bookmarkStart w:id="565" w:name="_Toc7527"/>
-      <w:bookmarkStart w:id="566" w:name="_Toc29760"/>
+      <w:bookmarkStart w:id="563" w:name="_Toc29050"/>
+      <w:bookmarkStart w:id="564" w:name="_Toc29760"/>
+      <w:bookmarkStart w:id="565" w:name="_Toc4618"/>
+      <w:bookmarkStart w:id="566" w:name="_Toc4658"/>
       <w:r>
         <w:rPr>
           <w:rFonts w:hint="eastAsia"/>
@@ -18772,19 +19230,19 @@
         <w:bidi w:val="0"/>
         <w:jc w:val="center"/>
       </w:pPr>
-      <w:bookmarkStart w:id="567" w:name="_Toc18040"/>
-      <w:bookmarkStart w:id="568" w:name="_Toc6831"/>
+      <w:bookmarkStart w:id="567" w:name="_Toc6831"/>
+      <w:bookmarkStart w:id="568" w:name="_Toc18040"/>
       <w:bookmarkStart w:id="569" w:name="_Toc15366"/>
       <w:bookmarkStart w:id="570" w:name="_Toc29139"/>
-      <w:bookmarkStart w:id="571" w:name="_Toc15483"/>
-      <w:bookmarkStart w:id="572" w:name="_Toc6805"/>
-      <w:bookmarkStart w:id="573" w:name="_Toc7077645"/>
-      <w:bookmarkStart w:id="574" w:name="_Toc27557"/>
-      <w:bookmarkStart w:id="575" w:name="_Toc20247"/>
-      <w:bookmarkStart w:id="576" w:name="_Toc23885"/>
-      <w:bookmarkStart w:id="577" w:name="_Toc23188"/>
-      <w:bookmarkStart w:id="578" w:name="_Toc19754"/>
-      <w:bookmarkStart w:id="579" w:name="_Toc31340"/>
+      <w:bookmarkStart w:id="571" w:name="_Toc27557"/>
+      <w:bookmarkStart w:id="572" w:name="_Toc20247"/>
+      <w:bookmarkStart w:id="573" w:name="_Toc31340"/>
+      <w:bookmarkStart w:id="574" w:name="_Toc23885"/>
+      <w:bookmarkStart w:id="575" w:name="_Toc19754"/>
+      <w:bookmarkStart w:id="576" w:name="_Toc23188"/>
+      <w:bookmarkStart w:id="577" w:name="_Toc6805"/>
+      <w:bookmarkStart w:id="578" w:name="_Toc7077645"/>
+      <w:bookmarkStart w:id="579" w:name="_Toc15483"/>
       <w:bookmarkStart w:id="580" w:name="_Toc167699786"/>
       <w:r>
         <w:rPr>
@@ -19197,19 +19655,19 @@
         <w:spacing w:before="409" w:after="409"/>
         <w:jc w:val="center"/>
       </w:pPr>
-      <w:bookmarkStart w:id="582" w:name="_Toc17527"/>
-      <w:bookmarkStart w:id="583" w:name="_Toc14638"/>
-      <w:bookmarkStart w:id="584" w:name="_Toc7077647"/>
-      <w:bookmarkStart w:id="585" w:name="_Toc25468"/>
+      <w:bookmarkStart w:id="582" w:name="_Toc8897"/>
+      <w:bookmarkStart w:id="583" w:name="_Toc7077647"/>
+      <w:bookmarkStart w:id="584" w:name="_Toc8266"/>
+      <w:bookmarkStart w:id="585" w:name="_Toc22089"/>
       <w:bookmarkStart w:id="586" w:name="_Toc1544"/>
-      <w:bookmarkStart w:id="587" w:name="_Toc8266"/>
-      <w:bookmarkStart w:id="588" w:name="_Toc22089"/>
-      <w:bookmarkStart w:id="589" w:name="_Toc18726"/>
-      <w:bookmarkStart w:id="590" w:name="_Toc193"/>
-      <w:bookmarkStart w:id="591" w:name="_Toc8897"/>
-      <w:bookmarkStart w:id="592" w:name="_Toc9578"/>
-      <w:bookmarkStart w:id="593" w:name="_Toc16543"/>
-      <w:bookmarkStart w:id="594" w:name="_Toc7892"/>
+      <w:bookmarkStart w:id="587" w:name="_Toc18726"/>
+      <w:bookmarkStart w:id="588" w:name="_Toc14638"/>
+      <w:bookmarkStart w:id="589" w:name="_Toc193"/>
+      <w:bookmarkStart w:id="590" w:name="_Toc16543"/>
+      <w:bookmarkStart w:id="591" w:name="_Toc7892"/>
+      <w:bookmarkStart w:id="592" w:name="_Toc17527"/>
+      <w:bookmarkStart w:id="593" w:name="_Toc25468"/>
+      <w:bookmarkStart w:id="594" w:name="_Toc9578"/>
       <w:bookmarkStart w:id="595" w:name="_Toc11403"/>
       <w:r>
         <w:rPr>
@@ -19306,17 +19764,17 @@
         <w:jc w:val="center"/>
       </w:pPr>
       <w:bookmarkStart w:id="596" w:name="_Toc23714"/>
-      <w:bookmarkStart w:id="597" w:name="_Toc21055"/>
-      <w:bookmarkStart w:id="598" w:name="_Toc10533"/>
-      <w:bookmarkStart w:id="599" w:name="_Toc4531"/>
-      <w:bookmarkStart w:id="600" w:name="_Toc21956"/>
-      <w:bookmarkStart w:id="601" w:name="_Toc20956"/>
-      <w:bookmarkStart w:id="602" w:name="_Toc23715"/>
-      <w:bookmarkStart w:id="603" w:name="_Toc24697"/>
-      <w:bookmarkStart w:id="604" w:name="_Toc7709"/>
-      <w:bookmarkStart w:id="605" w:name="_Toc9446"/>
-      <w:bookmarkStart w:id="606" w:name="_Toc23247"/>
-      <w:bookmarkStart w:id="607" w:name="_Toc31900"/>
+      <w:bookmarkStart w:id="597" w:name="_Toc20956"/>
+      <w:bookmarkStart w:id="598" w:name="_Toc9446"/>
+      <w:bookmarkStart w:id="599" w:name="_Toc23247"/>
+      <w:bookmarkStart w:id="600" w:name="_Toc31900"/>
+      <w:bookmarkStart w:id="601" w:name="_Toc23715"/>
+      <w:bookmarkStart w:id="602" w:name="_Toc7709"/>
+      <w:bookmarkStart w:id="603" w:name="_Toc21956"/>
+      <w:bookmarkStart w:id="604" w:name="_Toc24697"/>
+      <w:bookmarkStart w:id="605" w:name="_Toc21055"/>
+      <w:bookmarkStart w:id="606" w:name="_Toc4531"/>
+      <w:bookmarkStart w:id="607" w:name="_Toc10533"/>
       <w:bookmarkStart w:id="608" w:name="_Toc7077648"/>
       <w:r>
         <w:rPr>
@@ -20011,17 +20469,17 @@
         <w:spacing w:before="409" w:after="409"/>
         <w:jc w:val="center"/>
       </w:pPr>
-      <w:bookmarkStart w:id="609" w:name="_Toc18925"/>
-      <w:bookmarkStart w:id="610" w:name="_Toc13336"/>
+      <w:bookmarkStart w:id="609" w:name="_Toc1127"/>
+      <w:bookmarkStart w:id="610" w:name="_Toc19477"/>
       <w:bookmarkStart w:id="611" w:name="_Toc27960"/>
-      <w:bookmarkStart w:id="612" w:name="_Toc15899"/>
-      <w:bookmarkStart w:id="613" w:name="_Toc9407"/>
-      <w:bookmarkStart w:id="614" w:name="_Toc1127"/>
-      <w:bookmarkStart w:id="615" w:name="_Toc21182"/>
-      <w:bookmarkStart w:id="616" w:name="_Toc26647"/>
-      <w:bookmarkStart w:id="617" w:name="_Toc19477"/>
-      <w:bookmarkStart w:id="618" w:name="_Toc25156"/>
-      <w:bookmarkStart w:id="619" w:name="_Toc13908"/>
+      <w:bookmarkStart w:id="612" w:name="_Toc18925"/>
+      <w:bookmarkStart w:id="613" w:name="_Toc15899"/>
+      <w:bookmarkStart w:id="614" w:name="_Toc9407"/>
+      <w:bookmarkStart w:id="615" w:name="_Toc25156"/>
+      <w:bookmarkStart w:id="616" w:name="_Toc13908"/>
+      <w:bookmarkStart w:id="617" w:name="_Toc13336"/>
+      <w:bookmarkStart w:id="618" w:name="_Toc21182"/>
+      <w:bookmarkStart w:id="619" w:name="_Toc26647"/>
       <w:bookmarkStart w:id="620" w:name="_Toc25465"/>
       <w:r>
         <w:rPr>

</xml_diff>